<commit_message>
Enable rehomer replies and document role model
</commit_message>
<xml_diff>
--- a/docs/reports/Final_Report_Integrated_Draft_EN.docx
+++ b/docs/reports/Final_Report_Integrated_Draft_EN.docx
@@ -91,7 +91,13 @@
           <w:rFonts w:ascii="Aptos" w:hAnsi="Aptos" w:eastAsia="Yu Gothic"/>
           <w:color w:val="B22222"/>
         </w:rPr>
-        <w:t>This study develops and evaluates a risk-aware review interface for dog and cat rehoming in Japan. The prototype connects animal-specific care requirements, applicant plans, verification states and human decisions at each stage. Five adults will inspect synthetic cases, rate the clarity and decision usefulness of each stage, explain missing evidence and suggest next actions. Observed misunderstandings and interview comments will complement the ratings. This formative study cannot measure real-world screening duration or adoption outcomes. The software establishes technical feasibility; participant findings have not yet been collected.</w:t>
+        <w:t>This study develops and evaluates a risk-aware review interface for dog and cat rehoming in Japan. The prototype links animal-specific care requirements to applicant plans, verification states and a staged human decision. A scenario-based comparison of a basic profile view and a supported review view is designed to test review time, recognition of critical risks and quality of written reasons, including possible over-reliance on scores. The current software and synthetic cases establish feasibility; participant results and real-world adoption outcomes have not yet been obtained. The report preserves the original problem, design and evaluation proposal while distinguishing implemented functions from hypotheses awaiting evaluation.</w:t>
+      </w:r>
+      <w:r>
+        <w:rPr>
+          <w:color w:val="C00000"/>
+        </w:rPr>
+        <w:t xml:space="preserve"> The operating model preserves direct communication between the adopter and the rehomer, while PawMatch reviewers and administrators manage the more burdensome screening, evidence and workflow tasks.</w:t>
       </w:r>
     </w:p>
     <w:p>
@@ -237,7 +243,7 @@
           <w:rFonts w:ascii="Aptos" w:hAnsi="Aptos" w:eastAsia="Yu Gothic"/>
           <w:color w:val="B22222"/>
         </w:rPr>
-        <w:t>The administrative series describes public intake and disposition, not the quality of individual peer-to-peer screening. A decline in intake or euthanasia cannot be attributed to this prototype. This study examines whether its review stages make important information and the next human action understandable.</w:t>
+        <w:t>The administrative series describes public intake and disposition, not the quality of individual peer-to-peer screening. A decline in intake or euthanasia cannot be attributed to this prototype. The analytical outcome here is the quality and efficiency of a review decision.</w:t>
       </w:r>
     </w:p>
     <w:p>
@@ -250,7 +256,7 @@
           <w:rFonts w:ascii="Aptos" w:hAnsi="Aptos" w:eastAsia="Yu Gothic"/>
           <w:color w:val="000000"/>
         </w:rPr>
-        <w:t>Improved public statistics do not mean that rescue and rehoming needs have disappeared. Animal welfare organisations, volunteers, rescue cat cafes, and individual rescuers still deal with abandonment, abuse, medical care, adopter recruitment, post-adoption follow-up, and animal hoarding. Hoarding may involve deteriorating animal health, unhygienic conditions, neighbourhood conflict, and social isolation (Ministry of the Environment, 2021).</w:t>
+        <w:t>Improved public statistics do not mean that rescue and rehoming needs have disappeared. Animal welfare organisations, volunteers, rescue cat cafes, and individual rescuers still deal with abandonment, abuse, medical care, adopter recruitment, post-adoption follow-up, and animal hoarding. Hoarding may involve deteriorating animal health, unhygienic conditions, neighbourhood conflict, and social isolation (Ministry of the Environment, 2022).</w:t>
       </w:r>
     </w:p>
     <w:p>
@@ -449,7 +455,7 @@
           <w:rFonts w:ascii="Aptos" w:hAnsi="Aptos" w:eastAsia="Yu Gothic"/>
           <w:color w:val="B22222"/>
         </w:rPr>
-        <w:t>Existing work helps adopters understand the journey and organisations manage cases. The question here is whether the proposed sequence makes the animal's needs, the applicant's plan, outstanding checks and a defensible next action understandable at each stage. Participants' stage ratings, explanations and observed difficulties will identify where the workflow needs revision.</w:t>
+        <w:t>Existing work helps adopters understand the journey and organisations manage cases. This study asks a narrower unanswered question: when animal needs, applicant plans and pending checks appear together, can a reviewer identify important risks and explain the next action without relying only on the score? We will compare two views of the same synthetic cases. This will test the review process, not superiority over other products or an increase in real adoptions.</w:t>
       </w:r>
     </w:p>
     <w:p>
@@ -477,7 +483,7 @@
           <w:rFonts w:ascii="Aptos" w:hAnsi="Aptos" w:eastAsia="Yu Gothic"/>
           <w:color w:val="B22222"/>
         </w:rPr>
-        <w:t>The research aim is to learn which parts of the proposed review process help a person reach an informed next step, and which parts create confusion or unwarranted confidence. Three questions structure the formative evaluation:</w:t>
+        <w:t>The research questions (RQs) translate the aim into three observable comparisons between the basic and supported views:</w:t>
       </w:r>
     </w:p>
     <w:p>
@@ -490,7 +496,7 @@
           <w:rFonts w:ascii="Aptos" w:hAnsi="Aptos" w:eastAsia="Yu Gothic"/>
           <w:color w:val="B22222"/>
         </w:rPr>
-        <w:t>• RQ1 — Comprehension: At which stages can participants identify the relevant facts, unresolved checks and next action, and where do they misunderstand the workflow?</w:t>
+        <w:t>• RQ1 — Speed and safety: Can reviewers decide the appropriate next step more quickly while still finding the important risks specified in advance for each case? Measure review time together with critical-risk detection, not speed alone.</w:t>
       </w:r>
     </w:p>
     <w:p>
@@ -503,7 +509,7 @@
           <w:rFonts w:ascii="Aptos" w:hAnsi="Aptos" w:eastAsia="Yu Gothic"/>
           <w:color w:val="B22222"/>
         </w:rPr>
-        <w:t>• RQ2 — Perceived usefulness: Which stages do participants rate as useful for making a review decision, and what concrete examples support or challenge those ratings?</w:t>
+        <w:t>• RQ2 — Explainability: Can reviewers state why they made that decision and which facts still need to be checked? Compare written reasons and follow-up checks with a predefined case rubric.</w:t>
       </w:r>
     </w:p>
     <w:p>
@@ -516,7 +522,7 @@
           <w:rFonts w:ascii="Aptos" w:hAnsi="Aptos" w:eastAsia="Yu Gothic"/>
           <w:color w:val="B22222"/>
         </w:rPr>
-        <w:t>• RQ3 — Responsible use of scores: In a case with a high provisional score but missing housing or care evidence, do participants still request the necessary check, and how should the display be changed if they do not?</w:t>
+        <w:t>• RQ3 — Over-reliance: If a provisional score is high but housing or care evidence is still missing, do reviewers notice the pending check rather than advancing the case solely because of the number?</w:t>
       </w:r>
     </w:p>
     <w:p>
@@ -543,7 +549,7 @@
           <w:rFonts w:ascii="Aptos" w:hAnsi="Aptos" w:eastAsia="Yu Gothic"/>
           <w:color w:val="B22222"/>
         </w:rPr>
-        <w:t>The following specification retains the Proposal's design intent. Its original diagrams appear here, with the differences from the current implementation described beside them.</w:t>
+        <w:t>The following design specification is retained from Proposal; the implementation status and the revisions to its initial diagrams are stated immediately afterwards.</w:t>
       </w:r>
     </w:p>
     <w:p>
@@ -557,6 +563,77 @@
           <w:color w:val="000000"/>
         </w:rPr>
         <w:t>The proposed system is a risk-aware decision-support prototype for reviewing prospective adopters in peer-to-peer dog and cat rehoming. It is intended to support, rather than replace, human judgement. The system will not automatically approve or reject any applicant. Instead, it will structure relevant information and present review support in a way that helps human reviewers make more transparent and consistent decisions.</w:t>
+      </w:r>
+    </w:p>
+    <w:p>
+      <w:pPr/>
+      <w:r>
+        <w:rPr>
+          <w:color w:val="C00000"/>
+        </w:rPr>
+        <w:t>The basic operating unit of the system consists of four roles: (1) adopter, (2) rehomer, (3) reviewer and (4) administrator. Roles 3 and 4 are grouped as the service-side PawMatch operations team. The adopter asks questions and submits required information. The rehomer, who actually cares for the animal, answers questions about behaviour, health, daily care and adoption conditions. PawMatch operations organises and manages suitability review, documents, identity checks, workflow stages, decision rationale and audit records.</w:t>
+      </w:r>
+    </w:p>
+    <w:p>
+      <w:pPr/>
+      <w:r>
+        <w:rPr>
+          <w:color w:val="C00000"/>
+        </w:rPr>
+        <w:t>The enquiry history is a shared thread in which all three parties can participate. Pet-specific facts can be asked directly of the rehomer, whereas movement into formal screening, requests for additional evidence, identity checks and workflow updates are handled by PawMatch operations. The administrator is not normally the primary correspondent, but manages permissions, settings, accounts and audit access and may inspect records as part of operations. This division preserves the rehomer's knowledge and participation in the decision while transferring burdensome screening, procedure and verification work to the service provider.</w:t>
+      </w:r>
+    </w:p>
+    <w:p>
+      <w:pPr>
+        <w:keepNext/>
+        <w:jc w:val="center"/>
+      </w:pPr>
+      <w:r>
+        <w:drawing>
+          <wp:inline xmlns:a="http://schemas.openxmlformats.org/drawingml/2006/main" xmlns:pic="http://schemas.openxmlformats.org/drawingml/2006/picture">
+            <wp:extent cx="5897880" cy="3317558"/>
+            <wp:docPr id="5" name="Picture 5"/>
+            <wp:cNvGraphicFramePr>
+              <a:graphicFrameLocks noChangeAspect="1"/>
+            </wp:cNvGraphicFramePr>
+            <a:graphic>
+              <a:graphicData uri="http://schemas.openxmlformats.org/drawingml/2006/picture">
+                <pic:pic>
+                  <pic:nvPicPr>
+                    <pic:cNvPr id="0" name="role-model-en.png"/>
+                    <pic:cNvPicPr/>
+                  </pic:nvPicPr>
+                  <pic:blipFill>
+                    <a:blip r:embed="rId14"/>
+                    <a:stretch>
+                      <a:fillRect/>
+                    </a:stretch>
+                  </pic:blipFill>
+                  <pic:spPr>
+                    <a:xfrm>
+                      <a:off x="0" y="0"/>
+                      <a:ext cx="5897880" cy="3317558"/>
+                    </a:xfrm>
+                    <a:prstGeom prst="rect"/>
+                  </pic:spPr>
+                </pic:pic>
+              </a:graphicData>
+            </a:graphic>
+          </wp:inline>
+        </w:drawing>
+      </w:r>
+    </w:p>
+    <w:p>
+      <w:pPr>
+        <w:pStyle w:val="Caption"/>
+        <w:keepLines/>
+        <w:jc w:val="center"/>
+      </w:pPr>
+      <w:r>
+        <w:rPr>
+          <w:color w:val="C00000"/>
+        </w:rPr>
+        <w:t>Figure 2a PawMatch responsibility model: direct adopter-rehomer dialogue is retained while PawMatch operations supports screening, procedures and verification. Source: author.</w:t>
       </w:r>
     </w:p>
     <w:p>
@@ -613,56 +690,16 @@
     </w:p>
     <w:p>
       <w:pPr>
-        <w:spacing w:before="160" w:after="60"/>
-        <w:jc w:val="center"/>
-      </w:pPr>
-      <w:r>
-        <w:drawing>
-          <wp:inline xmlns:a="http://schemas.openxmlformats.org/drawingml/2006/main" xmlns:pic="http://schemas.openxmlformats.org/drawingml/2006/picture">
-            <wp:extent cx="6126480" cy="3230655"/>
-            <wp:docPr id="2" name="Picture 2"/>
-            <wp:cNvGraphicFramePr>
-              <a:graphicFrameLocks noChangeAspect="1"/>
-            </wp:cNvGraphicFramePr>
-            <a:graphic>
-              <a:graphicData uri="http://schemas.openxmlformats.org/drawingml/2006/picture">
-                <pic:pic>
-                  <pic:nvPicPr>
-                    <pic:cNvPr id="0" name="image.png"/>
-                    <pic:cNvPicPr/>
-                  </pic:nvPicPr>
-                  <pic:blipFill>
-                    <a:blip r:embed="rId10"/>
-                    <a:stretch>
-                      <a:fillRect/>
-                    </a:stretch>
-                  </pic:blipFill>
-                  <pic:spPr>
-                    <a:xfrm>
-                      <a:off x="0" y="0"/>
-                      <a:ext cx="6126480" cy="3230655"/>
-                    </a:xfrm>
-                    <a:prstGeom prst="rect"/>
-                  </pic:spPr>
-                </pic:pic>
-              </a:graphicData>
-            </a:graphic>
-          </wp:inline>
-        </w:drawing>
-      </w:r>
-    </w:p>
-    <w:p>
-      <w:pPr>
         <w:pStyle w:val="Caption"/>
         <w:keepNext w:val="0"/>
-        <w:spacing w:after="200" w:line="278" w:lineRule="auto"/>
+        <w:spacing w:after="280" w:line="278" w:lineRule="auto" w:before="200"/>
       </w:pPr>
       <w:r>
         <w:rPr>
           <w:rFonts w:ascii="Aptos" w:hAnsi="Aptos" w:eastAsia="Yu Gothic"/>
           <w:color w:val="B22222"/>
         </w:rPr>
-        <w:t>Figure 2 Proposal system overview. Source: author's original figure; the current implementation differs as described below.</w:t>
+        <w:t>Figure 2 Planned current system overview: animal and adopter profiles, case-specific checks, human review and feedback. The original Proposal design is preserved in Appendix B. [INSERT UPDATED LEGIBLE DIAGRAM]</w:t>
       </w:r>
     </w:p>
     <w:p>
@@ -673,63 +710,23 @@
       <w:r>
         <w:rPr>
           <w:rFonts w:ascii="Aptos" w:hAnsi="Aptos" w:eastAsia="Yu Gothic"/>
-          <w:color w:val="B22222"/>
+          <w:color w:val="000000"/>
         </w:rPr>
-        <w:t>The prototype brings animal needs, applicant plans, outstanding evidence and next actions into one review record. Its usefulness will be examined through a stage-by-stage walkthrough and participant feedback, without presenting a simulated click-through as a real adoption process.</w:t>
-      </w:r>
-    </w:p>
-    <w:p>
-      <w:pPr>
-        <w:spacing w:before="160" w:after="60"/>
-        <w:jc w:val="center"/>
-      </w:pPr>
-      <w:r>
-        <w:drawing>
-          <wp:inline xmlns:a="http://schemas.openxmlformats.org/drawingml/2006/main" xmlns:pic="http://schemas.openxmlformats.org/drawingml/2006/picture">
-            <wp:extent cx="6126480" cy="2365781"/>
-            <wp:docPr id="3" name="Picture 3"/>
-            <wp:cNvGraphicFramePr>
-              <a:graphicFrameLocks noChangeAspect="1"/>
-            </wp:cNvGraphicFramePr>
-            <a:graphic>
-              <a:graphicData uri="http://schemas.openxmlformats.org/drawingml/2006/picture">
-                <pic:pic>
-                  <pic:nvPicPr>
-                    <pic:cNvPr id="0" name="image.png"/>
-                    <pic:cNvPicPr/>
-                  </pic:nvPicPr>
-                  <pic:blipFill>
-                    <a:blip r:embed="rId11"/>
-                    <a:stretch>
-                      <a:fillRect/>
-                    </a:stretch>
-                  </pic:blipFill>
-                  <pic:spPr>
-                    <a:xfrm>
-                      <a:off x="0" y="0"/>
-                      <a:ext cx="6126480" cy="2365781"/>
-                    </a:xfrm>
-                    <a:prstGeom prst="rect"/>
-                  </pic:spPr>
-                </pic:pic>
-              </a:graphicData>
-            </a:graphic>
-          </wp:inline>
-        </w:drawing>
+        <w:t>For evaluation purposes, the prototype will include two review modes. The first will be a baseline applicant review screen that presents synthetic animal and adopter profiles in a simple list or profile format. The second will be the proposed risk-aware interface, which adds suitability scores, risk flags, verification statuses, and recommended next actions. This comparison will allow the project to examine whether the proposed design provides value beyond simply displaying applicant information.</w:t>
       </w:r>
     </w:p>
     <w:p>
       <w:pPr>
         <w:pStyle w:val="Caption"/>
         <w:keepNext w:val="0"/>
-        <w:spacing w:after="200" w:line="278" w:lineRule="auto"/>
+        <w:spacing w:after="280" w:line="278" w:lineRule="auto" w:before="200"/>
       </w:pPr>
       <w:r>
         <w:rPr>
           <w:rFonts w:ascii="Aptos" w:hAnsi="Aptos" w:eastAsia="Yu Gothic"/>
           <w:color w:val="B22222"/>
         </w:rPr>
-        <w:t>Figure 3 Proposal review workflow. Source: author's original figure. The implementation now records six stages and keeps final decisions with a person.</w:t>
+        <w:t>Figure 3 Planned six-stage review: initial screening → risk review → evidence verification → meeting → trial → final human decision. The original Proposal workflow is preserved in Appendix B. [INSERT UPDATED LEGIBLE DIAGRAM]</w:t>
       </w:r>
     </w:p>
     <w:p>
@@ -755,7 +752,7 @@
           <w:rFonts w:ascii="Aptos" w:hAnsi="Aptos" w:eastAsia="Yu Gothic"/>
           <w:color w:val="B22222"/>
         </w:rPr>
-        <w:t>Table 1 separates the basis for selecting review categories from the provisional numerical weights. The Ministry's guidance and the empirical studies identify relevant questions, but none establishes that housing should receive exactly 25 points. The initial ordering gives more weight to conditions directly relevant to safe housing and daily care. These weights are a configurable design assumption, not a validated risk model.</w:t>
+        <w:t>Table 1 separates the basis for selecting review categories from the provisional numerical weights. The Ministry's rehoming guidance and the empirical studies identify relevant questions, but none estimates a Japanese causal effect or establishes that housing should receive exactly 25 points. The initial ordering gives more weight to conditions that directly determine whether the animal can be kept safely and cared for daily. This is an explicit design hypothesis, to be reviewed with domain experts and sensitivity analysis rather than presented as a validated risk model.</w:t>
       </w:r>
     </w:p>
     <w:p>
@@ -1514,61 +1511,35 @@
           <w:rFonts w:ascii="Aptos" w:hAnsi="Aptos" w:eastAsia="Yu Gothic"/>
           <w:color w:val="B22222"/>
         </w:rPr>
-        <w:t>The six categories are assessed at category level: a concrete plan receives the full weight, a partial plan half, and unknown or conflicting evidence zero. Table 1's sub-checks guide review but have no separate points. Unknown remains 'needs information', not 'unsuitable'. Identity, housing verification and animal-specific conflicts are separate flags; no score alone approves, rejects or ranks a person. An administrator can change weights, subject to a total of 100 and a recorded reason. The current weights are used in operational review, while issued research sessions retain their original version. Before testing, the researcher will fix the selected weights and manually check a small number of alternative allocations to see whether displayed conclusions change.</w:t>
-      </w:r>
-    </w:p>
-    <w:p>
-      <w:pPr>
-        <w:spacing w:before="160" w:after="60"/>
-        <w:jc w:val="center"/>
-      </w:pPr>
-      <w:r>
-        <w:drawing>
-          <wp:inline xmlns:a="http://schemas.openxmlformats.org/drawingml/2006/main" xmlns:pic="http://schemas.openxmlformats.org/drawingml/2006/picture">
-            <wp:extent cx="6126480" cy="3280438"/>
-            <wp:docPr id="4" name="Picture 4"/>
-            <wp:cNvGraphicFramePr>
-              <a:graphicFrameLocks noChangeAspect="1"/>
-            </wp:cNvGraphicFramePr>
-            <a:graphic>
-              <a:graphicData uri="http://schemas.openxmlformats.org/drawingml/2006/picture">
-                <pic:pic>
-                  <pic:nvPicPr>
-                    <pic:cNvPr id="0" name="image.png"/>
-                    <pic:cNvPicPr/>
-                  </pic:nvPicPr>
-                  <pic:blipFill>
-                    <a:blip r:embed="rId12"/>
-                    <a:stretch>
-                      <a:fillRect/>
-                    </a:stretch>
-                  </pic:blipFill>
-                  <pic:spPr>
-                    <a:xfrm>
-                      <a:off x="0" y="0"/>
-                      <a:ext cx="6126480" cy="3280438"/>
-                    </a:xfrm>
-                    <a:prstGeom prst="rect"/>
-                  </pic:spPr>
-                </pic:pic>
-              </a:graphicData>
-            </a:graphic>
-          </wp:inline>
-        </w:drawing>
+        <w:t>The six categories are assessed at category level: a concrete, documented plan receives the full category weight; a partial plan receives half; and unknown or conflicting evidence receives zero. The sub-checks in Table 1 guide the reviewer but are not independently point-scored. Unknown is labelled 'needs information', not 'unsuitable'. Identity, housing verification and critical animal-specific conflicts remain separate flags; no score alone approves, rejects or ranks a person. An administrator can change the six weights in the research settings (total 100 and a recorded rationale). The current configuration is also used for ordinary review displays; saved research sessions keep the version and weights issued to them. Operational scores are recalculated under the active version, whereas previously recorded human decisions are not rewritten. Before participant testing, freeze the weights and check alternative plausible allocations.</w:t>
       </w:r>
     </w:p>
     <w:p>
       <w:pPr>
         <w:pStyle w:val="Caption"/>
         <w:keepNext w:val="0"/>
-        <w:spacing w:after="200" w:line="278" w:lineRule="auto"/>
+        <w:spacing w:after="280" w:line="278" w:lineRule="auto" w:before="200"/>
       </w:pPr>
       <w:r>
         <w:rPr>
           <w:rFonts w:ascii="Aptos" w:hAnsi="Aptos" w:eastAsia="Yu Gothic"/>
           <w:color w:val="B22222"/>
         </w:rPr>
-        <w:t>Proposal comparison diagram, retained in this section as an earlier design. Its two-view time comparison is not used in the final evaluation.</w:t>
+        <w:t>Figure 5 Planned implementation architecture: role-based web interface → REST API and review services → MongoDB or synthetic case store; research sessions and export are separate from demo activity. [INSERT VERIFIED DIAGRAM]</w:t>
+      </w:r>
+    </w:p>
+    <w:p>
+      <w:pPr>
+        <w:pStyle w:val="Caption"/>
+        <w:keepNext w:val="0"/>
+        <w:spacing w:after="280" w:line="278" w:lineRule="auto" w:before="200"/>
+      </w:pPr>
+      <w:r>
+        <w:rPr>
+          <w:rFonts w:ascii="Aptos" w:hAnsi="Aptos" w:eastAsia="Yu Gothic"/>
+          <w:color w:val="B22222"/>
+        </w:rPr>
+        <w:t>Figure 6 Planned UI evidence: animal needs beside the applicant's care plan, verification state and reviewer action; include the progress grid and the basic-view comparator as separate labelled panels. [INSERT DATED SCREENSHOTS]</w:t>
       </w:r>
     </w:p>
     <w:p>
@@ -1618,10 +1589,9 @@
       </w:pPr>
       <w:r>
         <w:rPr>
-          <w:rFonts w:ascii="Aptos" w:hAnsi="Aptos" w:eastAsia="Yu Gothic"/>
-          <w:color w:val="000000"/>
+          <w:color w:val="C00000"/>
         </w:rPr>
-        <w:t>Decision Support Systems are relevant because the proposed prototype is intended to organise information and assist judgement rather than automate it. The final decision remains with the human reviewer. This is important because rehoming decisions can affect animal welfare, adopter responsibility, and the privacy of applicants. A fully automated approval or rejection process would be inappropriate for this context.</w:t>
+        <w:t>Decision Support Systems are relevant because the prototype organises information and assists judgement rather than automating it. PawMatch operations organises and records the evidence and next action, but final adoption requires agreement between the adopter and rehomer. Because adoption decisions affect animal welfare, applicant responsibility and personal information, fully automatic approval or rejection would be inappropriate in this context.</w:t>
       </w:r>
     </w:p>
     <w:p>
@@ -1686,7 +1656,7 @@
           <w:rFonts w:ascii="Aptos" w:hAnsi="Aptos" w:eastAsia="Yu Gothic"/>
           <w:color w:val="B22222"/>
         </w:rPr>
-        <w:t>This is decision support, not a substitute for a rehoming worker. Griffin et al. (2020) found limited research support for many familiar screening criteria; each check therefore needs an explicit reason. Parasuraman and Manzey (2010) explain how people can over-trust automated advice. PawMatch keeps unresolved checks visible even when the provisional score is high. Participants will be asked what they would check next in such a case. Before any use with real applicants, the author will compare the checks with published guidance, document limitations, and seek practical feedback from a rescue worker if one is available; the prototype will not be presented as a validated assessment tool.</w:t>
+        <w:t>This is decision support, not a substitute for a rehoming worker. Griffin et al. (2020) show that many familiar adopter criteria have limited research support, so each check should have an explicit reason rather than being applied as an unquestioned rule. Parasuraman and Manzey (2010) explain why people can over-trust automated advice. PawMatch therefore displays the evidence behind each provisional point and keeps unresolved checks visible even when the total is high. The evaluation will test whether reviewers actually notice these warnings. Expert review of the case rubric and alternative weight settings are still needed before use with real applicants.</w:t>
       </w:r>
     </w:p>
     <w:p>
@@ -1711,9 +1681,9 @@
       <w:r>
         <w:rPr>
           <w:rFonts w:ascii="Aptos" w:hAnsi="Aptos" w:eastAsia="Yu Gothic"/>
-          <w:color w:val="B22222"/>
+          <w:color w:val="000000"/>
         </w:rPr>
-        <w:t>The evaluation will use a guided walkthrough of synthetic animal and applicant cases. Participants will inspect the application, verification, risk review, contact, meeting or trial, and final-record stages, then describe what they understand, what evidence is missing and what they would do next.</w:t>
+        <w:t>The evaluation will use scenario-based user testing with synthetic animal and adopter profiles. The purpose is to assess whether the prototype supports the review process, rather than merely demonstrating that the software functions technically. Participants will review the same rehoming scenarios using both a baseline interface and the proposed risk-aware interface.</w:t>
       </w:r>
     </w:p>
     <w:p>
@@ -1724,9 +1694,9 @@
       <w:r>
         <w:rPr>
           <w:rFonts w:ascii="Aptos" w:hAnsi="Aptos" w:eastAsia="Yu Gothic"/>
-          <w:color w:val="B22222"/>
+          <w:color w:val="000000"/>
         </w:rPr>
-        <w:t>For each stage, participants will rate clarity, usefulness for the next decision and confidence in their understanding on a five-point scale, and give a concrete reason. They will also identify one important unresolved issue in selected cases and explain which additional check or communication is needed. The study will not ask them to complete a real adoption decision.</w:t>
+        <w:t>The baseline interface will show applicant information in a simple profile or list format. The proposed interface will add weighted suitability scores, risk flags, verification statuses, and recommended next actions. Participants will be asked to identify the applicant who should proceed to the next review stage, identify applicants requiring additional checks, list relevant risks, and explain their decision.</w:t>
       </w:r>
     </w:p>
     <w:p>
@@ -1750,9 +1720,9 @@
       <w:r>
         <w:rPr>
           <w:rFonts w:ascii="Aptos" w:hAnsi="Aptos" w:eastAsia="Yu Gothic"/>
-          <w:color w:val="B22222"/>
+          <w:color w:val="000000"/>
         </w:rPr>
-        <w:t>The primary findings will be stage-specific ratings, observed misunderstandings and participants' explanations of missing evidence and next actions. A predefined case checklist will identify whether essential checks were mentioned, but this is a comprehension probe, not a measure of real screening accuracy. Click-through time and raw risk counts will not be treated as evidence of operational efficiency or as a comparison with existing services.</w:t>
+        <w:t>The evaluation will measure review time, number of relevant risks identified, consistency of applicant prioritisation, clarity of decision explanations, perceived usefulness, clarity of risk flags and verification statuses, and possible over-reliance on scores. These measures will help determine whether the risk-aware interface improves efficiency, consistency, and explainability compared with the baseline interface.</w:t>
       </w:r>
     </w:p>
     <w:p>
@@ -1763,63 +1733,23 @@
       <w:r>
         <w:rPr>
           <w:rFonts w:ascii="Aptos" w:hAnsi="Aptos" w:eastAsia="Yu Gothic"/>
-          <w:color w:val="B22222"/>
+          <w:color w:val="000000"/>
         </w:rPr>
-        <w:t>Figure 4 summarises the proposed walkthrough: five consenting adults inspect selected synthetic cases, rate each review stage, explain a next action and discuss difficulties in a short interview. The resulting matrix links every reported problem to a stage and a possible design change.</w:t>
-      </w:r>
-    </w:p>
-    <w:p>
-      <w:pPr>
-        <w:spacing w:before="160" w:after="80"/>
-        <w:jc w:val="center"/>
-      </w:pPr>
-      <w:r>
-        <w:drawing>
-          <wp:inline xmlns:a="http://schemas.openxmlformats.org/drawingml/2006/main" xmlns:pic="http://schemas.openxmlformats.org/drawingml/2006/picture">
-            <wp:extent cx="6126480" cy="2339201"/>
-            <wp:docPr id="5" name="Picture 5"/>
-            <wp:cNvGraphicFramePr>
-              <a:graphicFrameLocks noChangeAspect="1"/>
-            </wp:cNvGraphicFramePr>
-            <a:graphic>
-              <a:graphicData uri="http://schemas.openxmlformats.org/drawingml/2006/picture">
-                <pic:pic>
-                  <pic:nvPicPr>
-                    <pic:cNvPr id="0" name="image.png"/>
-                    <pic:cNvPicPr/>
-                  </pic:nvPicPr>
-                  <pic:blipFill>
-                    <a:blip r:embed="rId13"/>
-                    <a:stretch>
-                      <a:fillRect/>
-                    </a:stretch>
-                  </pic:blipFill>
-                  <pic:spPr>
-                    <a:xfrm>
-                      <a:off x="0" y="0"/>
-                      <a:ext cx="6126480" cy="2339201"/>
-                    </a:xfrm>
-                    <a:prstGeom prst="rect"/>
-                  </pic:spPr>
-                </pic:pic>
-              </a:graphicData>
-            </a:graphic>
-          </wp:inline>
-        </w:drawing>
+        <w:t>Figure 4 shows the evaluation design. Participants will review the same synthetic rehoming scenario using two different interfaces: a baseline applicant list and the proposed risk-aware interface. The results will then be compared using measures such as review time, number of risks identified, clarity of decision explanation and perceived usefulness.</w:t>
       </w:r>
     </w:p>
     <w:p>
       <w:pPr>
         <w:pStyle w:val="Caption"/>
         <w:keepNext w:val="0"/>
-        <w:spacing w:after="200" w:line="278" w:lineRule="auto"/>
+        <w:spacing w:after="280" w:line="278" w:lineRule="auto" w:before="200"/>
       </w:pPr>
       <w:r>
         <w:rPr>
           <w:rFonts w:ascii="Aptos" w:hAnsi="Aptos" w:eastAsia="Yu Gothic"/>
           <w:color w:val="B22222"/>
         </w:rPr>
-        <w:t>Figure 4 Draft formative evaluation design. Source: author; participants' stage feedback and observed misunderstandings, not review-time benchmarking.</w:t>
+        <w:t>Figure 4 Planned comparison design: AB/BA order, repeated-case learning caveat, review time and critical-risk detection. The original Proposal comparison figure is preserved in Appendix B. [INSERT UPDATED LEGIBLE DIAGRAM]</w:t>
       </w:r>
     </w:p>
     <w:p>
@@ -1846,7 +1776,7 @@
           <w:rFonts w:ascii="Aptos" w:hAnsi="Aptos" w:eastAsia="Yu Gothic"/>
           <w:color w:val="B22222"/>
         </w:rPr>
-        <w:t>The evaluation targets five consenting adults. GOV.UK guidance recommends five to six people for qualitative task-based usability testing (Office for Health Improvement and Disparities, 2020). The separate GOV.UK guidance for quantitative service benchmarking recommends 30–60 actual or likely users (GOV.UK User Research Community, 2018). The present study is a small formative walkthrough: its ratings locate stages to improve and its interviews explain why. It is not a benchmark of review efficiency or a measure of adoption outcomes.</w:t>
+        <w:t>This formative evaluation targets five consenting adult participants. The Office for Health Improvement and Disparities (2020) recommends five to six people for qualitative usability testing, which is intended to identify usability issues in tasks. By contrast, the GOV.UK User Research Community (2018) advises recruiting 30 to 60 actual or likely users for service-wide usability benchmarking. Five participants are a pragmatic choice for this individual project, not a powered sample or a service benchmark. Recorded times and risk counts will be reported descriptively alongside observed difficulties and written reasons; they cannot establish statistical significance, population performance or a real-world reduction in screening time.</w:t>
       </w:r>
     </w:p>
     <w:p>
@@ -1859,7 +1789,7 @@
           <w:rFonts w:ascii="Aptos" w:hAnsi="Aptos" w:eastAsia="Yu Gothic"/>
           <w:color w:val="B22222"/>
         </w:rPr>
-        <w:t>Each participant will examine two distinct synthetic cases once, so repeating the same case does not create an artificial learning advantage. After each of the six review stages, ask three 1–5 questions: Was the purpose and status clear? Was the information useful for deciding the next action? How confident are you that you understood what remains unverified? A low score must be explained; all scores invite a concrete example. During two case probes, ask the participant to state the missing evidence and next contact or check. Observe navigation and misunderstandings without coaching. Finish with a short semi-structured interview about unnecessary steps, misleading scores and missing information. Report a stage-by-person matrix, rating distributions with the denominator, recurring themes, disconfirming comments and the resulting design changes. Five people do not validate use by rescue organisations unless relevant practitioners are actually represented.</w:t>
+        <w:t>Each participant will see two selected synthetic cases in both modes, making four tasks. AB and BA display orders will be alternated; with five people the split is necessarily three versus two, and repeating cases may teach participants what to look for. Per-person differences in critical risks found and review time will be shown together with concrete usability observations, acceptable next steps, written reasons, perceived clarity and possible high-score over-reliance. Free text will be coded against a predefined rubric, with denominators, missing data, order and relevant experience disclosed. The study will look for design problems and promising signals, not estimate an average treatment effect. If no animal-welfare practitioner participates, the findings cannot validate use by rehoming organisations.</w:t>
       </w:r>
     </w:p>
     <w:p>
@@ -1872,7 +1802,7 @@
           <w:rFonts w:ascii="Aptos" w:hAnsi="Aptos" w:eastAsia="Yu Gothic"/>
           <w:color w:val="B22222"/>
         </w:rPr>
-        <w:t>[PENDING VALIDATION: record oral or email consent as permitted by the approved ethics process; recruitment, eligibility, actual participant count and dates; the fixed survey and case prompts. Do not replace participant responses with synthetic ones.]</w:t>
+        <w:t>[PENDING VALIDATION: document written opt-in consent, recruitment, eligibility, participant count, dates, ethics approval if required, a frozen risk rubric and scoring weights. Do not substitute simulated participants or invented times.]</w:t>
       </w:r>
     </w:p>
     <w:p>
@@ -2301,7 +2231,7 @@
                 <w:color w:val="000000"/>
                 <w:sz w:val="18"/>
               </w:rPr>
-              <w:t>Design the review screen, risk flags, verification status and recommended actions.</w:t>
+              <w:t>Design the baseline screen, risk-aware interface, review screen, risk flag display, and recommended action display.</w:t>
             </w:r>
           </w:p>
         </w:tc>
@@ -2668,9 +2598,9 @@
       <w:r>
         <w:rPr>
           <w:rFonts w:ascii="Aptos" w:hAnsi="Aptos" w:eastAsia="Yu Gothic"/>
-          <w:color w:val="B22222"/>
+          <w:color w:val="000000"/>
         </w:rPr>
-        <w:t>The final report, GitHub artefacts and three-minute video will use one or two representative scenarios. The demonstration will show how a reviewer traces the animal's needs, the applicant's plan, unresolved checks and a human-recorded next action. It will not present simulated clicking speed as an improvement in real-world adoption processing.</w:t>
+        <w:t>For Assessment 3, the final report, GitHub artefacts, and three-minute video will be prepared around one or two representative scenarios. The demonstration should show how risks that are less visible in the baseline screen become easier to identify in the risk-aware interface through scores, flags, verification statuses, and recommended actions.</w:t>
       </w:r>
     </w:p>
     <w:p>
@@ -2736,7 +2666,7 @@
           <w:rFonts w:ascii="Aptos" w:hAnsi="Aptos" w:eastAsia="Yu Gothic"/>
           <w:color w:val="B22222"/>
         </w:rPr>
-        <w:t>Adult testers will receive a brief explanation and give consent orally or by email before participating, subject to university ethics requirements. The researcher will record the date, method and scope of consent. Research notes will use participant codes; withdrawal, access, retention and deletion arrangements will be explained. Testing may use the researcher's PC or a prepared demo server, with synthetic accounts only. No real identity documents, facial images or income evidence will be collected.</w:t>
+        <w:t>External adult testers must receive a clear information sheet and provide written opt-in consent before participating. Research records should use participant codes, support withdrawal and apply documented access, retention and deletion rules. The demo login is not production-grade identity verification; this study does not collect real identity documents, facial images or income evidence.</w:t>
       </w:r>
     </w:p>
     <w:p>
@@ -2763,7 +2693,16 @@
           <w:rFonts w:ascii="Aptos" w:hAnsi="Aptos" w:eastAsia="Yu Gothic"/>
           <w:color w:val="B22222"/>
         </w:rPr>
-        <w:t>The implemented stack and planned public submission repository are shown below. The prototype has role-specific screens and a human-controlled review workflow. Before submission, migrate the checked source snapshot to that repository, run the tests again and record the exact submitted commit.</w:t>
+        <w:t>The source repository and the implemented technology are shown below. The application is a research prototype with role-specific screens and a human-controlled review workflow. The repository URL identifies the configured project, while the exact submitted commit should be checked against the final test run.</w:t>
+      </w:r>
+    </w:p>
+    <w:p>
+      <w:pPr/>
+      <w:r>
+        <w:rPr>
+          <w:color w:val="C00000"/>
+        </w:rPr>
+        <w:t>In the enquiry thread, only the adopter who opened the enquiry, the rehomer responsible for the listed pet and PawMatch operations can read and send messages. Role labels distinguish pet-specific answers from operational guidance. Unrelated rehomers cannot access another person's enquiry, while authority to advance formal screening stages remains restricted to reviewers and administrators.</w:t>
       </w:r>
     </w:p>
     <w:p>
@@ -2773,73 +2712,9 @@
       </w:pPr>
       <w:r>
         <w:rPr>
-          <w:rFonts w:ascii="Aptos" w:hAnsi="Aptos" w:eastAsia="Yu Gothic"/>
-          <w:color w:val="B22222"/>
+          <w:color w:val="C00000"/>
         </w:rPr>
-        <w:t xml:space="preserve">Planned public submission repository: </w:t>
-      </w:r>
-      <w:hyperlink r:id="rId14">
-        <w:r>
-          <w:rPr>
-            <w:color w:val="B22222"/>
-            <w:u w:val="single"/>
-          </w:rPr>
-          <w:t>https://github.com/SerikaKawano/PawMatch</w:t>
-        </w:r>
-      </w:hyperlink>
-    </w:p>
-    <w:p>
-      <w:pPr>
-        <w:spacing w:before="160" w:after="80"/>
-        <w:jc w:val="center"/>
-      </w:pPr>
-      <w:r>
-        <w:drawing>
-          <wp:inline xmlns:a="http://schemas.openxmlformats.org/drawingml/2006/main" xmlns:pic="http://schemas.openxmlformats.org/drawingml/2006/picture">
-            <wp:extent cx="6126480" cy="2561983"/>
-            <wp:docPr id="6" name="Picture 6"/>
-            <wp:cNvGraphicFramePr>
-              <a:graphicFrameLocks noChangeAspect="1"/>
-            </wp:cNvGraphicFramePr>
-            <a:graphic>
-              <a:graphicData uri="http://schemas.openxmlformats.org/drawingml/2006/picture">
-                <pic:pic>
-                  <pic:nvPicPr>
-                    <pic:cNvPr id="0" name="image.png"/>
-                    <pic:cNvPicPr/>
-                  </pic:nvPicPr>
-                  <pic:blipFill>
-                    <a:blip r:embed="rId15"/>
-                    <a:stretch>
-                      <a:fillRect/>
-                    </a:stretch>
-                  </pic:blipFill>
-                  <pic:spPr>
-                    <a:xfrm>
-                      <a:off x="0" y="0"/>
-                      <a:ext cx="6126480" cy="2561983"/>
-                    </a:xfrm>
-                    <a:prstGeom prst="rect"/>
-                  </pic:spPr>
-                </pic:pic>
-              </a:graphicData>
-            </a:graphic>
-          </wp:inline>
-        </w:drawing>
-      </w:r>
-    </w:p>
-    <w:p>
-      <w:pPr>
-        <w:pStyle w:val="Caption"/>
-        <w:keepNext w:val="0"/>
-        <w:spacing w:after="200" w:line="278" w:lineRule="auto"/>
-      </w:pPr>
-      <w:r>
-        <w:rPr>
-          <w:rFonts w:ascii="Aptos" w:hAnsi="Aptos" w:eastAsia="Yu Gothic"/>
-          <w:color w:val="B22222"/>
-        </w:rPr>
-        <w:t>Figure 5 Draft implementation architecture. Source: author's diagram based on the prototype code; to be reviewed before submission.</w:t>
+        <w:t>Source repository: https://github.com/SerikaKawano/PawMatch</w:t>
       </w:r>
     </w:p>
     <w:p>
@@ -3387,29 +3262,14 @@
     </w:p>
     <w:p>
       <w:pPr>
-        <w:pStyle w:val="Caption"/>
-        <w:keepNext w:val="0"/>
-        <w:spacing w:after="280" w:line="278" w:lineRule="auto" w:before="200"/>
-      </w:pPr>
-      <w:r>
-        <w:rPr>
-          <w:rFonts w:ascii="Aptos" w:hAnsi="Aptos" w:eastAsia="Yu Gothic"/>
-          <w:color w:val="B22222"/>
-        </w:rPr>
-        <w:t>Figure 6 Planned UI screenshots: animal needs, applicant care plan, verification state, next reviewer action and the progress grid. [INSERT DATED SCREENSHOTS]</w:t>
-      </w:r>
-    </w:p>
-    <w:p>
-      <w:pPr>
         <w:keepNext w:val="0"/>
         <w:spacing w:after="140" w:line="278" w:lineRule="auto"/>
       </w:pPr>
       <w:r>
         <w:rPr>
-          <w:rFonts w:ascii="Aptos" w:hAnsi="Aptos" w:eastAsia="Yu Gothic"/>
-          <w:color w:val="B22222"/>
+          <w:color w:val="C00000"/>
         </w:rPr>
-        <w:t>Table 4 reports checks run on the local working tree on 25 September 2026. The automated tests cover role boundaries, consultation ownership, synthetic-case consistency, separation of scores from verification, propagation of administrator weights, consent and withdrawal in study sessions, and human-gated final review. They verify selected software behaviour; they do not establish usability, fairness, animal-welfare impact or adoption outcomes.</w:t>
+        <w:t>Table 4 reports checks run on the local working tree on 28 September 2026. The automated tests cover role boundaries, consultation ownership, synthetic-case consistency, separation of scores from verification, propagation of administrator weights, consent and withdrawal in study sessions, and human-gated final review. They verify selected software behaviour; they do not establish usability, fairness, animal-welfare impact or adoption outcomes.</w:t>
       </w:r>
     </w:p>
     <w:p>
@@ -3420,10 +3280,9 @@
       </w:pPr>
       <w:r>
         <w:rPr>
-          <w:rFonts w:ascii="Aptos" w:hAnsi="Aptos" w:eastAsia="Yu Gothic"/>
-          <w:color w:val="B22222"/>
+          <w:color w:val="C00000"/>
         </w:rPr>
-        <w:t>Table 4 Local automated verification on 25 September 2026</w:t>
+        <w:t>Table 4 Local automated verification on 28 September 2026</w:t>
       </w:r>
     </w:p>
     <w:tbl>
@@ -3604,12 +3463,9 @@
             </w:pPr>
             <w:r>
               <w:rPr>
-                <w:rFonts w:ascii="Aptos" w:hAnsi="Aptos" w:eastAsia="Yu Gothic"/>
-                <w:b w:val="0"/>
-                <w:color w:val="B22222"/>
-                <w:sz w:val="19"/>
+                <w:color w:val="C00000"/>
               </w:rPr>
-              <w:t>22 passed; 0 failed</w:t>
+              <w:t>39 passed; 0 failed</w:t>
             </w:r>
           </w:p>
         </w:tc>
@@ -3865,7 +3721,7 @@
           <w:rFonts w:ascii="Aptos" w:hAnsi="Aptos" w:eastAsia="Yu Gothic"/>
           <w:color w:val="B22222"/>
         </w:rPr>
-        <w:t>10 Formative participant evaluation pending</w:t>
+        <w:t>10 Participant results to complete</w:t>
       </w:r>
     </w:p>
     <w:p>
@@ -3878,7 +3734,7 @@
           <w:rFonts w:ascii="Aptos" w:hAnsi="Aptos" w:eastAsia="Yu Gothic"/>
           <w:color w:val="B22222"/>
         </w:rPr>
-        <w:t>[PENDING RESULTS: report the number invited, consented, completed and withdrawn; each stage's valid response count and 1–5 ratings; observed misunderstandings; case-probe explanations; recurring and contradictory comments; and concrete design changes. Quote a participant only with permission. No participant result is claimed at this stage.]</w:t>
+        <w:t>[PENDING RESULTS: report invited, consented, started, completed and withdrawn counts; review-time distribution; critical risks detected out of opportunities; acceptable next steps; coded explanations; high-score over-reliance; missing data; and paired case-level comparisons. Quote participants only with consent. No participant outcome is claimed at this stage.]</w:t>
       </w:r>
     </w:p>
     <w:tbl>
@@ -3888,10 +3744,9 @@
         <w:tblLook w:firstColumn="1" w:firstRow="1" w:lastColumn="0" w:lastRow="0" w:noHBand="0" w:noVBand="1" w:val="04A0"/>
       </w:tblPr>
       <w:tblGrid>
-        <w:gridCol w:w="1944"/>
-        <w:gridCol w:w="2592"/>
+        <w:gridCol w:w="3312"/>
         <w:gridCol w:w="3240"/>
-        <w:gridCol w:w="2088"/>
+        <w:gridCol w:w="3312"/>
       </w:tblGrid>
       <w:tr>
         <w:trPr>
@@ -3900,7 +3755,7 @@
         </w:trPr>
         <w:tc>
           <w:tcPr>
-            <w:tcW w:type="dxa" w:w="2484"/>
+            <w:tcW w:type="dxa" w:w="3312"/>
             <w:vAlign w:val="center"/>
             <w:tcBorders>
               <w:top w:val="single" w:sz="5" w:color="D9D9D9"/>
@@ -3926,15 +3781,15 @@
                 <w:rFonts w:ascii="Aptos" w:hAnsi="Aptos" w:eastAsia="Yu Gothic"/>
                 <w:b/>
                 <w:color w:val="B22222"/>
-                <w:sz w:val="18"/>
+                <w:sz w:val="19"/>
               </w:rPr>
-              <w:t>Review stage</w:t>
+              <w:t>Outcome</w:t>
             </w:r>
           </w:p>
         </w:tc>
         <w:tc>
           <w:tcPr>
-            <w:tcW w:type="dxa" w:w="2484"/>
+            <w:tcW w:type="dxa" w:w="3312"/>
             <w:vAlign w:val="center"/>
             <w:tcBorders>
               <w:top w:val="single" w:sz="5" w:color="D9D9D9"/>
@@ -3960,15 +3815,15 @@
                 <w:rFonts w:ascii="Aptos" w:hAnsi="Aptos" w:eastAsia="Yu Gothic"/>
                 <w:b/>
                 <w:color w:val="B22222"/>
-                <w:sz w:val="18"/>
+                <w:sz w:val="19"/>
               </w:rPr>
-              <w:t>Ratings / valid n</w:t>
+              <w:t>Basic view</w:t>
             </w:r>
           </w:p>
         </w:tc>
         <w:tc>
           <w:tcPr>
-            <w:tcW w:type="dxa" w:w="2484"/>
+            <w:tcW w:type="dxa" w:w="3312"/>
             <w:vAlign w:val="center"/>
             <w:tcBorders>
               <w:top w:val="single" w:sz="5" w:color="D9D9D9"/>
@@ -3994,43 +3849,9 @@
                 <w:rFonts w:ascii="Aptos" w:hAnsi="Aptos" w:eastAsia="Yu Gothic"/>
                 <w:b/>
                 <w:color w:val="B22222"/>
-                <w:sz w:val="18"/>
+                <w:sz w:val="19"/>
               </w:rPr>
-              <w:t>Observed issue and comment</w:t>
-            </w:r>
-          </w:p>
-        </w:tc>
-        <w:tc>
-          <w:tcPr>
-            <w:tcW w:type="dxa" w:w="2484"/>
-            <w:vAlign w:val="center"/>
-            <w:tcBorders>
-              <w:top w:val="single" w:sz="5" w:color="D9D9D9"/>
-              <w:left w:val="single" w:sz="5" w:color="D9D9D9"/>
-              <w:bottom w:val="single" w:sz="5" w:color="D9D9D9"/>
-              <w:right w:val="single" w:sz="5" w:color="D9D9D9"/>
-            </w:tcBorders>
-            <w:tcMar>
-              <w:top w:w="55" w:type="dxa"/>
-              <w:bottom w:w="55" w:type="dxa"/>
-              <w:left w:w="90" w:type="dxa"/>
-              <w:right w:w="90" w:type="dxa"/>
-            </w:tcMar>
-            <w:shd w:fill="EDE7E2"/>
-          </w:tcPr>
-          <w:p>
-            <w:pPr>
-              <w:keepNext/>
-              <w:spacing w:before="0" w:after="0" w:line="269" w:lineRule="auto"/>
-            </w:pPr>
-            <w:r>
-              <w:rPr>
-                <w:rFonts w:ascii="Aptos" w:hAnsi="Aptos" w:eastAsia="Yu Gothic"/>
-                <w:b/>
-                <w:color w:val="B22222"/>
-                <w:sz w:val="18"/>
-              </w:rPr>
-              <w:t>Proposed revision</w:t>
+              <w:t>Supported view</w:t>
             </w:r>
           </w:p>
         </w:tc>
@@ -4041,7 +3862,7 @@
         </w:trPr>
         <w:tc>
           <w:tcPr>
-            <w:tcW w:type="dxa" w:w="2484"/>
+            <w:tcW w:type="dxa" w:w="3312"/>
             <w:vAlign w:val="center"/>
             <w:tcBorders>
               <w:top w:val="single" w:sz="5" w:color="D9D9D9"/>
@@ -4065,15 +3886,15 @@
                 <w:rFonts w:ascii="Aptos" w:hAnsi="Aptos" w:eastAsia="Yu Gothic"/>
                 <w:b w:val="0"/>
                 <w:color w:val="B22222"/>
-                <w:sz w:val="18"/>
+                <w:sz w:val="19"/>
               </w:rPr>
-              <w:t>Application intake</w:t>
+              <w:t>Completed reviews</w:t>
             </w:r>
           </w:p>
         </w:tc>
         <w:tc>
           <w:tcPr>
-            <w:tcW w:type="dxa" w:w="2484"/>
+            <w:tcW w:type="dxa" w:w="3312"/>
             <w:vAlign w:val="center"/>
             <w:tcBorders>
               <w:top w:val="single" w:sz="5" w:color="D9D9D9"/>
@@ -4097,15 +3918,15 @@
                 <w:rFonts w:ascii="Aptos" w:hAnsi="Aptos" w:eastAsia="Yu Gothic"/>
                 <w:b w:val="0"/>
                 <w:color w:val="B22222"/>
-                <w:sz w:val="18"/>
+                <w:sz w:val="19"/>
               </w:rPr>
-              <w:t>[clarity/use/confidence; n]</w:t>
+              <w:t>[n]</w:t>
             </w:r>
           </w:p>
         </w:tc>
         <w:tc>
           <w:tcPr>
-            <w:tcW w:type="dxa" w:w="2484"/>
+            <w:tcW w:type="dxa" w:w="3312"/>
             <w:vAlign w:val="center"/>
             <w:tcBorders>
               <w:top w:val="single" w:sz="5" w:color="D9D9D9"/>
@@ -4129,15 +3950,20 @@
                 <w:rFonts w:ascii="Aptos" w:hAnsi="Aptos" w:eastAsia="Yu Gothic"/>
                 <w:b w:val="0"/>
                 <w:color w:val="B22222"/>
-                <w:sz w:val="18"/>
+                <w:sz w:val="19"/>
               </w:rPr>
-              <w:t>[evidence + quote]</w:t>
+              <w:t>[n]</w:t>
             </w:r>
           </w:p>
         </w:tc>
+      </w:tr>
+      <w:tr>
+        <w:trPr>
+          <w:cantSplit/>
+        </w:trPr>
         <w:tc>
           <w:tcPr>
-            <w:tcW w:type="dxa" w:w="2484"/>
+            <w:tcW w:type="dxa" w:w="3312"/>
             <w:vAlign w:val="center"/>
             <w:tcBorders>
               <w:top w:val="single" w:sz="5" w:color="D9D9D9"/>
@@ -4161,20 +3987,15 @@
                 <w:rFonts w:ascii="Aptos" w:hAnsi="Aptos" w:eastAsia="Yu Gothic"/>
                 <w:b w:val="0"/>
                 <w:color w:val="B22222"/>
-                <w:sz w:val="18"/>
+                <w:sz w:val="19"/>
               </w:rPr>
-              <w:t>[change]</w:t>
+              <w:t>Review time</w:t>
             </w:r>
           </w:p>
         </w:tc>
-      </w:tr>
-      <w:tr>
-        <w:trPr>
-          <w:cantSplit/>
-        </w:trPr>
         <w:tc>
           <w:tcPr>
-            <w:tcW w:type="dxa" w:w="2484"/>
+            <w:tcW w:type="dxa" w:w="3312"/>
             <w:vAlign w:val="center"/>
             <w:tcBorders>
               <w:top w:val="single" w:sz="5" w:color="D9D9D9"/>
@@ -4198,15 +4019,15 @@
                 <w:rFonts w:ascii="Aptos" w:hAnsi="Aptos" w:eastAsia="Yu Gothic"/>
                 <w:b w:val="0"/>
                 <w:color w:val="B22222"/>
-                <w:sz w:val="18"/>
+                <w:sz w:val="19"/>
               </w:rPr>
-              <w:t>Initial check</w:t>
+              <w:t>[median and spread]</w:t>
             </w:r>
           </w:p>
         </w:tc>
         <w:tc>
           <w:tcPr>
-            <w:tcW w:type="dxa" w:w="2484"/>
+            <w:tcW w:type="dxa" w:w="3312"/>
             <w:vAlign w:val="center"/>
             <w:tcBorders>
               <w:top w:val="single" w:sz="5" w:color="D9D9D9"/>
@@ -4230,15 +4051,20 @@
                 <w:rFonts w:ascii="Aptos" w:hAnsi="Aptos" w:eastAsia="Yu Gothic"/>
                 <w:b w:val="0"/>
                 <w:color w:val="B22222"/>
-                <w:sz w:val="18"/>
+                <w:sz w:val="19"/>
               </w:rPr>
-              <w:t>[...; n]</w:t>
+              <w:t>[median and spread]</w:t>
             </w:r>
           </w:p>
         </w:tc>
+      </w:tr>
+      <w:tr>
+        <w:trPr>
+          <w:cantSplit/>
+        </w:trPr>
         <w:tc>
           <w:tcPr>
-            <w:tcW w:type="dxa" w:w="2484"/>
+            <w:tcW w:type="dxa" w:w="3312"/>
             <w:vAlign w:val="center"/>
             <w:tcBorders>
               <w:top w:val="single" w:sz="5" w:color="D9D9D9"/>
@@ -4262,15 +4088,15 @@
                 <w:rFonts w:ascii="Aptos" w:hAnsi="Aptos" w:eastAsia="Yu Gothic"/>
                 <w:b w:val="0"/>
                 <w:color w:val="B22222"/>
-                <w:sz w:val="18"/>
+                <w:sz w:val="19"/>
               </w:rPr>
-              <w:t>[evidence + quote]</w:t>
+              <w:t>Critical risks found</w:t>
             </w:r>
           </w:p>
         </w:tc>
         <w:tc>
           <w:tcPr>
-            <w:tcW w:type="dxa" w:w="2484"/>
+            <w:tcW w:type="dxa" w:w="3312"/>
             <w:vAlign w:val="center"/>
             <w:tcBorders>
               <w:top w:val="single" w:sz="5" w:color="D9D9D9"/>
@@ -4294,20 +4120,15 @@
                 <w:rFonts w:ascii="Aptos" w:hAnsi="Aptos" w:eastAsia="Yu Gothic"/>
                 <w:b w:val="0"/>
                 <w:color w:val="B22222"/>
-                <w:sz w:val="18"/>
+                <w:sz w:val="19"/>
               </w:rPr>
-              <w:t>[change]</w:t>
+              <w:t>[count / opportunities]</w:t>
             </w:r>
           </w:p>
         </w:tc>
-      </w:tr>
-      <w:tr>
-        <w:trPr>
-          <w:cantSplit/>
-        </w:trPr>
         <w:tc>
           <w:tcPr>
-            <w:tcW w:type="dxa" w:w="2484"/>
+            <w:tcW w:type="dxa" w:w="3312"/>
             <w:vAlign w:val="center"/>
             <w:tcBorders>
               <w:top w:val="single" w:sz="5" w:color="D9D9D9"/>
@@ -4331,15 +4152,20 @@
                 <w:rFonts w:ascii="Aptos" w:hAnsi="Aptos" w:eastAsia="Yu Gothic"/>
                 <w:b w:val="0"/>
                 <w:color w:val="B22222"/>
-                <w:sz w:val="18"/>
+                <w:sz w:val="19"/>
               </w:rPr>
-              <w:t>Risk and fit</w:t>
+              <w:t>[count / opportunities]</w:t>
             </w:r>
           </w:p>
         </w:tc>
+      </w:tr>
+      <w:tr>
+        <w:trPr>
+          <w:cantSplit/>
+        </w:trPr>
         <w:tc>
           <w:tcPr>
-            <w:tcW w:type="dxa" w:w="2484"/>
+            <w:tcW w:type="dxa" w:w="3312"/>
             <w:vAlign w:val="center"/>
             <w:tcBorders>
               <w:top w:val="single" w:sz="5" w:color="D9D9D9"/>
@@ -4363,15 +4189,15 @@
                 <w:rFonts w:ascii="Aptos" w:hAnsi="Aptos" w:eastAsia="Yu Gothic"/>
                 <w:b w:val="0"/>
                 <w:color w:val="B22222"/>
-                <w:sz w:val="18"/>
+                <w:sz w:val="19"/>
               </w:rPr>
-              <w:t>[...; n]</w:t>
+              <w:t>Acceptable next steps</w:t>
             </w:r>
           </w:p>
         </w:tc>
         <w:tc>
           <w:tcPr>
-            <w:tcW w:type="dxa" w:w="2484"/>
+            <w:tcW w:type="dxa" w:w="3312"/>
             <w:vAlign w:val="center"/>
             <w:tcBorders>
               <w:top w:val="single" w:sz="5" w:color="D9D9D9"/>
@@ -4395,15 +4221,15 @@
                 <w:rFonts w:ascii="Aptos" w:hAnsi="Aptos" w:eastAsia="Yu Gothic"/>
                 <w:b w:val="0"/>
                 <w:color w:val="B22222"/>
-                <w:sz w:val="18"/>
+                <w:sz w:val="19"/>
               </w:rPr>
-              <w:t>[evidence + quote]</w:t>
+              <w:t>[count / total]</w:t>
             </w:r>
           </w:p>
         </w:tc>
         <w:tc>
           <w:tcPr>
-            <w:tcW w:type="dxa" w:w="2484"/>
+            <w:tcW w:type="dxa" w:w="3312"/>
             <w:vAlign w:val="center"/>
             <w:tcBorders>
               <w:top w:val="single" w:sz="5" w:color="D9D9D9"/>
@@ -4427,9 +4253,9 @@
                 <w:rFonts w:ascii="Aptos" w:hAnsi="Aptos" w:eastAsia="Yu Gothic"/>
                 <w:b w:val="0"/>
                 <w:color w:val="B22222"/>
-                <w:sz w:val="18"/>
+                <w:sz w:val="19"/>
               </w:rPr>
-              <w:t>[change]</w:t>
+              <w:t>[count / total]</w:t>
             </w:r>
           </w:p>
         </w:tc>
@@ -4440,7 +4266,7 @@
         </w:trPr>
         <w:tc>
           <w:tcPr>
-            <w:tcW w:type="dxa" w:w="2484"/>
+            <w:tcW w:type="dxa" w:w="3312"/>
             <w:vAlign w:val="center"/>
             <w:tcBorders>
               <w:top w:val="single" w:sz="5" w:color="D9D9D9"/>
@@ -4464,15 +4290,15 @@
                 <w:rFonts w:ascii="Aptos" w:hAnsi="Aptos" w:eastAsia="Yu Gothic"/>
                 <w:b w:val="0"/>
                 <w:color w:val="B22222"/>
-                <w:sz w:val="18"/>
+                <w:sz w:val="19"/>
               </w:rPr>
-              <w:t>Verification/contact</w:t>
+              <w:t>Score over-reliance</w:t>
             </w:r>
           </w:p>
         </w:tc>
         <w:tc>
           <w:tcPr>
-            <w:tcW w:type="dxa" w:w="2484"/>
+            <w:tcW w:type="dxa" w:w="3312"/>
             <w:vAlign w:val="center"/>
             <w:tcBorders>
               <w:top w:val="single" w:sz="5" w:color="D9D9D9"/>
@@ -4496,15 +4322,15 @@
                 <w:rFonts w:ascii="Aptos" w:hAnsi="Aptos" w:eastAsia="Yu Gothic"/>
                 <w:b w:val="0"/>
                 <w:color w:val="B22222"/>
-                <w:sz w:val="18"/>
+                <w:sz w:val="19"/>
               </w:rPr>
-              <w:t>[...; n]</w:t>
+              <w:t>[count / relevant cases]</w:t>
             </w:r>
           </w:p>
         </w:tc>
         <w:tc>
           <w:tcPr>
-            <w:tcW w:type="dxa" w:w="2484"/>
+            <w:tcW w:type="dxa" w:w="3312"/>
             <w:vAlign w:val="center"/>
             <w:tcBorders>
               <w:top w:val="single" w:sz="5" w:color="D9D9D9"/>
@@ -4528,307 +4354,9 @@
                 <w:rFonts w:ascii="Aptos" w:hAnsi="Aptos" w:eastAsia="Yu Gothic"/>
                 <w:b w:val="0"/>
                 <w:color w:val="B22222"/>
-                <w:sz w:val="18"/>
+                <w:sz w:val="19"/>
               </w:rPr>
-              <w:t>[evidence + quote]</w:t>
-            </w:r>
-          </w:p>
-        </w:tc>
-        <w:tc>
-          <w:tcPr>
-            <w:tcW w:type="dxa" w:w="2484"/>
-            <w:vAlign w:val="center"/>
-            <w:tcBorders>
-              <w:top w:val="single" w:sz="5" w:color="D9D9D9"/>
-              <w:left w:val="single" w:sz="5" w:color="D9D9D9"/>
-              <w:bottom w:val="single" w:sz="5" w:color="D9D9D9"/>
-              <w:right w:val="single" w:sz="5" w:color="D9D9D9"/>
-            </w:tcBorders>
-            <w:tcMar>
-              <w:top w:w="55" w:type="dxa"/>
-              <w:bottom w:w="55" w:type="dxa"/>
-              <w:left w:w="90" w:type="dxa"/>
-              <w:right w:w="90" w:type="dxa"/>
-            </w:tcMar>
-          </w:tcPr>
-          <w:p>
-            <w:pPr>
-              <w:spacing w:before="0" w:after="0" w:line="269" w:lineRule="auto"/>
-            </w:pPr>
-            <w:r>
-              <w:rPr>
-                <w:rFonts w:ascii="Aptos" w:hAnsi="Aptos" w:eastAsia="Yu Gothic"/>
-                <w:b w:val="0"/>
-                <w:color w:val="B22222"/>
-                <w:sz w:val="18"/>
-              </w:rPr>
-              <w:t>[change]</w:t>
-            </w:r>
-          </w:p>
-        </w:tc>
-      </w:tr>
-      <w:tr>
-        <w:trPr>
-          <w:cantSplit/>
-        </w:trPr>
-        <w:tc>
-          <w:tcPr>
-            <w:tcW w:type="dxa" w:w="2484"/>
-            <w:vAlign w:val="center"/>
-            <w:tcBorders>
-              <w:top w:val="single" w:sz="5" w:color="D9D9D9"/>
-              <w:left w:val="single" w:sz="5" w:color="D9D9D9"/>
-              <w:bottom w:val="single" w:sz="5" w:color="D9D9D9"/>
-              <w:right w:val="single" w:sz="5" w:color="D9D9D9"/>
-            </w:tcBorders>
-            <w:tcMar>
-              <w:top w:w="55" w:type="dxa"/>
-              <w:bottom w:w="55" w:type="dxa"/>
-              <w:left w:w="90" w:type="dxa"/>
-              <w:right w:w="90" w:type="dxa"/>
-            </w:tcMar>
-          </w:tcPr>
-          <w:p>
-            <w:pPr>
-              <w:spacing w:before="0" w:after="0" w:line="269" w:lineRule="auto"/>
-            </w:pPr>
-            <w:r>
-              <w:rPr>
-                <w:rFonts w:ascii="Aptos" w:hAnsi="Aptos" w:eastAsia="Yu Gothic"/>
-                <w:b w:val="0"/>
-                <w:color w:val="B22222"/>
-                <w:sz w:val="18"/>
-              </w:rPr>
-              <w:t>Meeting/trial</w:t>
-            </w:r>
-          </w:p>
-        </w:tc>
-        <w:tc>
-          <w:tcPr>
-            <w:tcW w:type="dxa" w:w="2484"/>
-            <w:vAlign w:val="center"/>
-            <w:tcBorders>
-              <w:top w:val="single" w:sz="5" w:color="D9D9D9"/>
-              <w:left w:val="single" w:sz="5" w:color="D9D9D9"/>
-              <w:bottom w:val="single" w:sz="5" w:color="D9D9D9"/>
-              <w:right w:val="single" w:sz="5" w:color="D9D9D9"/>
-            </w:tcBorders>
-            <w:tcMar>
-              <w:top w:w="55" w:type="dxa"/>
-              <w:bottom w:w="55" w:type="dxa"/>
-              <w:left w:w="90" w:type="dxa"/>
-              <w:right w:w="90" w:type="dxa"/>
-            </w:tcMar>
-          </w:tcPr>
-          <w:p>
-            <w:pPr>
-              <w:spacing w:before="0" w:after="0" w:line="269" w:lineRule="auto"/>
-            </w:pPr>
-            <w:r>
-              <w:rPr>
-                <w:rFonts w:ascii="Aptos" w:hAnsi="Aptos" w:eastAsia="Yu Gothic"/>
-                <w:b w:val="0"/>
-                <w:color w:val="B22222"/>
-                <w:sz w:val="18"/>
-              </w:rPr>
-              <w:t>[...; n]</w:t>
-            </w:r>
-          </w:p>
-        </w:tc>
-        <w:tc>
-          <w:tcPr>
-            <w:tcW w:type="dxa" w:w="2484"/>
-            <w:vAlign w:val="center"/>
-            <w:tcBorders>
-              <w:top w:val="single" w:sz="5" w:color="D9D9D9"/>
-              <w:left w:val="single" w:sz="5" w:color="D9D9D9"/>
-              <w:bottom w:val="single" w:sz="5" w:color="D9D9D9"/>
-              <w:right w:val="single" w:sz="5" w:color="D9D9D9"/>
-            </w:tcBorders>
-            <w:tcMar>
-              <w:top w:w="55" w:type="dxa"/>
-              <w:bottom w:w="55" w:type="dxa"/>
-              <w:left w:w="90" w:type="dxa"/>
-              <w:right w:w="90" w:type="dxa"/>
-            </w:tcMar>
-          </w:tcPr>
-          <w:p>
-            <w:pPr>
-              <w:spacing w:before="0" w:after="0" w:line="269" w:lineRule="auto"/>
-            </w:pPr>
-            <w:r>
-              <w:rPr>
-                <w:rFonts w:ascii="Aptos" w:hAnsi="Aptos" w:eastAsia="Yu Gothic"/>
-                <w:b w:val="0"/>
-                <w:color w:val="B22222"/>
-                <w:sz w:val="18"/>
-              </w:rPr>
-              <w:t>[evidence + quote]</w:t>
-            </w:r>
-          </w:p>
-        </w:tc>
-        <w:tc>
-          <w:tcPr>
-            <w:tcW w:type="dxa" w:w="2484"/>
-            <w:vAlign w:val="center"/>
-            <w:tcBorders>
-              <w:top w:val="single" w:sz="5" w:color="D9D9D9"/>
-              <w:left w:val="single" w:sz="5" w:color="D9D9D9"/>
-              <w:bottom w:val="single" w:sz="5" w:color="D9D9D9"/>
-              <w:right w:val="single" w:sz="5" w:color="D9D9D9"/>
-            </w:tcBorders>
-            <w:tcMar>
-              <w:top w:w="55" w:type="dxa"/>
-              <w:bottom w:w="55" w:type="dxa"/>
-              <w:left w:w="90" w:type="dxa"/>
-              <w:right w:w="90" w:type="dxa"/>
-            </w:tcMar>
-          </w:tcPr>
-          <w:p>
-            <w:pPr>
-              <w:spacing w:before="0" w:after="0" w:line="269" w:lineRule="auto"/>
-            </w:pPr>
-            <w:r>
-              <w:rPr>
-                <w:rFonts w:ascii="Aptos" w:hAnsi="Aptos" w:eastAsia="Yu Gothic"/>
-                <w:b w:val="0"/>
-                <w:color w:val="B22222"/>
-                <w:sz w:val="18"/>
-              </w:rPr>
-              <w:t>[change]</w:t>
-            </w:r>
-          </w:p>
-        </w:tc>
-      </w:tr>
-      <w:tr>
-        <w:trPr>
-          <w:cantSplit/>
-        </w:trPr>
-        <w:tc>
-          <w:tcPr>
-            <w:tcW w:type="dxa" w:w="2484"/>
-            <w:vAlign w:val="center"/>
-            <w:tcBorders>
-              <w:top w:val="single" w:sz="5" w:color="D9D9D9"/>
-              <w:left w:val="single" w:sz="5" w:color="D9D9D9"/>
-              <w:bottom w:val="single" w:sz="5" w:color="D9D9D9"/>
-              <w:right w:val="single" w:sz="5" w:color="D9D9D9"/>
-            </w:tcBorders>
-            <w:tcMar>
-              <w:top w:w="55" w:type="dxa"/>
-              <w:bottom w:w="55" w:type="dxa"/>
-              <w:left w:w="90" w:type="dxa"/>
-              <w:right w:w="90" w:type="dxa"/>
-            </w:tcMar>
-          </w:tcPr>
-          <w:p>
-            <w:pPr>
-              <w:spacing w:before="0" w:after="0" w:line="269" w:lineRule="auto"/>
-            </w:pPr>
-            <w:r>
-              <w:rPr>
-                <w:rFonts w:ascii="Aptos" w:hAnsi="Aptos" w:eastAsia="Yu Gothic"/>
-                <w:b w:val="0"/>
-                <w:color w:val="B22222"/>
-                <w:sz w:val="18"/>
-              </w:rPr>
-              <w:t>Final record</w:t>
-            </w:r>
-          </w:p>
-        </w:tc>
-        <w:tc>
-          <w:tcPr>
-            <w:tcW w:type="dxa" w:w="2484"/>
-            <w:vAlign w:val="center"/>
-            <w:tcBorders>
-              <w:top w:val="single" w:sz="5" w:color="D9D9D9"/>
-              <w:left w:val="single" w:sz="5" w:color="D9D9D9"/>
-              <w:bottom w:val="single" w:sz="5" w:color="D9D9D9"/>
-              <w:right w:val="single" w:sz="5" w:color="D9D9D9"/>
-            </w:tcBorders>
-            <w:tcMar>
-              <w:top w:w="55" w:type="dxa"/>
-              <w:bottom w:w="55" w:type="dxa"/>
-              <w:left w:w="90" w:type="dxa"/>
-              <w:right w:w="90" w:type="dxa"/>
-            </w:tcMar>
-          </w:tcPr>
-          <w:p>
-            <w:pPr>
-              <w:spacing w:before="0" w:after="0" w:line="269" w:lineRule="auto"/>
-            </w:pPr>
-            <w:r>
-              <w:rPr>
-                <w:rFonts w:ascii="Aptos" w:hAnsi="Aptos" w:eastAsia="Yu Gothic"/>
-                <w:b w:val="0"/>
-                <w:color w:val="B22222"/>
-                <w:sz w:val="18"/>
-              </w:rPr>
-              <w:t>[...; n]</w:t>
-            </w:r>
-          </w:p>
-        </w:tc>
-        <w:tc>
-          <w:tcPr>
-            <w:tcW w:type="dxa" w:w="2484"/>
-            <w:vAlign w:val="center"/>
-            <w:tcBorders>
-              <w:top w:val="single" w:sz="5" w:color="D9D9D9"/>
-              <w:left w:val="single" w:sz="5" w:color="D9D9D9"/>
-              <w:bottom w:val="single" w:sz="5" w:color="D9D9D9"/>
-              <w:right w:val="single" w:sz="5" w:color="D9D9D9"/>
-            </w:tcBorders>
-            <w:tcMar>
-              <w:top w:w="55" w:type="dxa"/>
-              <w:bottom w:w="55" w:type="dxa"/>
-              <w:left w:w="90" w:type="dxa"/>
-              <w:right w:w="90" w:type="dxa"/>
-            </w:tcMar>
-          </w:tcPr>
-          <w:p>
-            <w:pPr>
-              <w:spacing w:before="0" w:after="0" w:line="269" w:lineRule="auto"/>
-            </w:pPr>
-            <w:r>
-              <w:rPr>
-                <w:rFonts w:ascii="Aptos" w:hAnsi="Aptos" w:eastAsia="Yu Gothic"/>
-                <w:b w:val="0"/>
-                <w:color w:val="B22222"/>
-                <w:sz w:val="18"/>
-              </w:rPr>
-              <w:t>[evidence + quote]</w:t>
-            </w:r>
-          </w:p>
-        </w:tc>
-        <w:tc>
-          <w:tcPr>
-            <w:tcW w:type="dxa" w:w="2484"/>
-            <w:vAlign w:val="center"/>
-            <w:tcBorders>
-              <w:top w:val="single" w:sz="5" w:color="D9D9D9"/>
-              <w:left w:val="single" w:sz="5" w:color="D9D9D9"/>
-              <w:bottom w:val="single" w:sz="5" w:color="D9D9D9"/>
-              <w:right w:val="single" w:sz="5" w:color="D9D9D9"/>
-            </w:tcBorders>
-            <w:tcMar>
-              <w:top w:w="55" w:type="dxa"/>
-              <w:bottom w:w="55" w:type="dxa"/>
-              <w:left w:w="90" w:type="dxa"/>
-              <w:right w:w="90" w:type="dxa"/>
-            </w:tcMar>
-          </w:tcPr>
-          <w:p>
-            <w:pPr>
-              <w:spacing w:before="0" w:after="0" w:line="269" w:lineRule="auto"/>
-            </w:pPr>
-            <w:r>
-              <w:rPr>
-                <w:rFonts w:ascii="Aptos" w:hAnsi="Aptos" w:eastAsia="Yu Gothic"/>
-                <w:b w:val="0"/>
-                <w:color w:val="B22222"/>
-                <w:sz w:val="18"/>
-              </w:rPr>
-              <w:t>[change]</w:t>
+              <w:t>[count / relevant cases]</w:t>
             </w:r>
           </w:p>
         </w:tc>
@@ -4841,15 +4369,16 @@
     </w:p>
     <w:p>
       <w:pPr>
+        <w:pStyle w:val="Caption"/>
         <w:keepNext w:val="0"/>
-        <w:spacing w:after="140" w:line="278" w:lineRule="auto"/>
+        <w:spacing w:after="280" w:line="278" w:lineRule="auto" w:before="200"/>
       </w:pPr>
       <w:r>
         <w:rPr>
           <w:rFonts w:ascii="Aptos" w:hAnsi="Aptos" w:eastAsia="Yu Gothic"/>
           <w:color w:val="B22222"/>
         </w:rPr>
-        <w:t>For each stage, show the five individual responses or a compact distribution rather than a single average. The three ratings are not interchangeable: a stage can be clear but still fail to support the next decision. Code interview comments as 'understood', 'missing evidence', 'misleading cue', 'unnecessary step' or 'other', retain counterexamples, and link every proposed change to an observed statement or behaviour.</w:t>
+        <w:t>Figure 7 Planned results figure: paired review time and critical-risk recall by mode, with denominators and uncertainty shown. [INSERT ONLY AFTER REAL PARTICIPANT DATA ARE COLLECTED]</w:t>
       </w:r>
     </w:p>
     <w:p>
@@ -4876,7 +4405,7 @@
           <w:rFonts w:ascii="Aptos" w:hAnsi="Aptos" w:eastAsia="Yu Gothic"/>
           <w:color w:val="B22222"/>
         </w:rPr>
-        <w:t>The methodological contribution is a traceable link from a review stage to a participant's rating, explanation, observed difficulty and design revision. Five participants are appropriate for locating usability problems, but their professional experience and the authored cases affect what is observed. If all five misunderstand a stage, that is a strong reason to revise it; if none does, the stage is not thereby validated for all rehoming organisations. A score that prompts unjustified advancement is a design problem even if participants otherwise rate the interface highly. Real placements, returns and animal welfare require field follow-up and lie outside this study.</w:t>
+        <w:t>The anticipated methodological contribution is an inspectable comparison of two review displays on the same synthetic cases. With five self-selected participants, researcher-written cases and scoring rules, learning between repeated tasks and differences in domain experience can strongly influence every observation. Even a unanimous pattern would be a finding about these tasks and people, not a precise estimate for rehoming organisations. Faster review would not be beneficial if critical risks are missed; better detection may carry a time cost. If scores encourage unjustified advancement, the design should be revised. Real placement success, return and animal welfare require field follow-up and are outside this short evaluation.</w:t>
       </w:r>
     </w:p>
     <w:p>
@@ -4914,9 +4443,9 @@
       <w:r>
         <w:rPr>
           <w:rFonts w:ascii="Aptos" w:hAnsi="Aptos" w:eastAsia="Yu Gothic"/>
-          <w:color w:val="B22222"/>
+          <w:color w:val="000000"/>
         </w:rPr>
-        <w:t>Synthetic cases permit a low-risk formative study. Stage-by-stage ratings, observed misunderstandings and explanations of missing evidence may identify which parts of the review workflow are useful or need revision. They cannot establish a change in real placement outcomes or in the duration of communication with applicants and organisations.</w:t>
+        <w:t>The project also contributes an ethically low-risk evaluation design by using synthetic data and fictional scenarios. If the evaluation shows that the risk-aware interface improves risk identification, review consistency, decision explanation, or perceived usefulness compared with a baseline interface, it will provide evidence that this type of decision-support approach has potential value for safer and more transparent peer-to-peer rehoming workflows.</w:t>
       </w:r>
     </w:p>
     <w:p>
@@ -4929,7 +4458,7 @@
           <w:rFonts w:ascii="Aptos" w:hAnsi="Aptos" w:eastAsia="Yu Gothic"/>
           <w:color w:val="B22222"/>
         </w:rPr>
-        <w:t>The contribution has two parts: a working review artefact and a reproducible method for locating stage-specific design problems. Only the software has been technically checked so far. Neither synthetic cases nor a three-minute video can establish a change in real adoption rates.</w:t>
+        <w:t>Three distinct claims require separate evidence: a working software artefact, a reproducible comparison and an effect on reviewers. Only the first is technically evidenced so far. Synthetic cases and the three-minute video cannot establish a change in real adoption rates.</w:t>
       </w:r>
     </w:p>
     <w:p>
@@ -4954,10 +4483,9 @@
       </w:pPr>
       <w:r>
         <w:rPr>
-          <w:rFonts w:ascii="Aptos" w:hAnsi="Aptos" w:eastAsia="Yu Gothic"/>
-          <w:color w:val="B22222"/>
+          <w:color w:val="C00000"/>
         </w:rPr>
-        <w:t>This study advances a specific design hypothesis: rehoming review may be simplified not by omitting checks, but by bringing each animal's care needs, the applicant's plan, outstanding evidence and the next human action into one traceable decision. The prototype implements that workflow, and the 22 passing automated tests establish selected functional properties. They do not show that people make better decisions with it.</w:t>
+        <w:t>This study advances a specific design hypothesis: rehoming review may be simplified not by omitting checks, but by bringing each animal's care needs, the applicant's plan, outstanding evidence and the next human action into one traceable decision. The prototype implements that workflow, and the 39 passing automated tests establish selected functional properties. They do not show that people make better decisions with it.</w:t>
       </w:r>
     </w:p>
     <w:p>
@@ -4970,7 +4498,7 @@
           <w:rFonts w:ascii="Aptos" w:hAnsi="Aptos" w:eastAsia="Yu Gothic"/>
           <w:color w:val="B22222"/>
         </w:rPr>
-        <w:t>The testable design hypothesis is that a reviewer can use each stage to identify the next necessary check and explain its reason, without treating a high provisional score as approval. Stage ratings show perceived clarity and usefulness; case probes and observed misunderstandings test whether that perception is borne out. If a stage receives high ratings but participants miss a housing or care check, the positive rating will not be treated as evidence that the stage works. [After testing: insert the actual response matrix, notable counterexamples and changes made; report stages that did not help as clearly as those that did.]</w:t>
+        <w:t>The testable prediction is that, compared with a basic profile view, the supported view will help reviewers identify at least as many predefined critical risks, give more specific reasons and follow-up checks, and reach an appropriate next-step decision in less time. A high-scoring case with unresolved housing or care evidence tests whether the interface prevents numerical over-reliance. A time saving accompanied by more missed critical risks would refute a claim of safe simplification; improved detection with longer review would reveal an efficiency–safety trade-off. [After participant testing: insert the observed differences, denominators and uncertainty, including null or adverse results, and state which parts of the hypothesis survived.]</w:t>
       </w:r>
     </w:p>
     <w:p>
@@ -4983,7 +4511,7 @@
           <w:rFonts w:ascii="Aptos" w:hAnsi="Aptos" w:eastAsia="Yu Gothic"/>
           <w:color w:val="B22222"/>
         </w:rPr>
-        <w:t>The present finding is that an inspectable, human-controlled review flow can be built and technically checked. The planned five-person study can improve that design through stage-specific feedback; it cannot establish shorter real-world adoption processing or better animal welfare. Those longer-term outcomes would require field cooperation and post-placement follow-up. The three-minute video demonstrates the artefact but does not replace participant evidence.</w:t>
+        <w:t>Until that comparison is completed, the defensible finding is that a reviewable, human-controlled workflow can be built and technically checked, not that it increases adoptions or improves animal welfare. Five qualitative sessions may identify design problems or suggest a direction for later research, but cannot validate a general efficiency gain. Field research with rescue organisations and post-placement follow-up would be needed for those longer-term outcomes. The three-minute video will demonstrate the software and research question, not replace participant evidence.</w:t>
       </w:r>
     </w:p>
     <w:p>
@@ -5017,7 +4545,7 @@
           <w:color w:val="B22222"/>
           <w:sz w:val="19"/>
         </w:rPr>
-        <w:t>Chang, M. and Cañarte, G. (2023) 'Agapet: Supporting a responsible adoption process for stray and abandoned pets in urban areas', Extended Abstracts of the 2023 CHI Conference on Human Factors in Computing Systems, pp. 1–5. doi: 10.1145/3544549.3583845. Conference listing: https://chi2023.acm.org/for-authors/student-design-competition/ (Accessed: 27 September 2026).</w:t>
+        <w:t>Chang, M. and Cañarte, G. (2023) 'Agapet: Supporting a responsible adoption process for stray and abandoned pets in urban areas', Extended Abstracts of the 2023 CHI Conference on Human Factors in Computing Systems, pp. 1–5. doi: 10.1145/3544549.3583845.</w:t>
       </w:r>
     </w:p>
     <w:p>
@@ -5047,7 +4575,7 @@
           <w:color w:val="B22222"/>
           <w:sz w:val="19"/>
         </w:rPr>
-        <w:t>Griffin, K.E., John, E., Pike, T. and Mills, D.S. (2020) 'Can This Dog Be Rehomed to You? A Qualitative Analysis and Assessment of the Scientific Quality of the Potential Adopter Screening Policies and Procedures of Rehoming Organisations', Frontiers in Veterinary Science, 7, 617525. doi: 10.3389/fvets.2020.617525.</w:t>
+        <w:t>Griffin, K.E., John, E., Pike, T. and Mills, D.S. (2020) 'Can This Dog Be Rehomed to You?', Frontiers in Veterinary Science, 7, 617525. doi: 10.3389/fvets.2020.617525.</w:t>
       </w:r>
     </w:p>
     <w:p>
@@ -5062,7 +4590,7 @@
           <w:color w:val="B22222"/>
           <w:sz w:val="19"/>
         </w:rPr>
-        <w:t>Lord, L.K., Reider, L., Herron, M.E. and Graszak, K. (2008) 'Health and behavior problems in dogs and cats one week and one month after adoption from animal shelters', Journal of the American Veterinary Medical Association, 233(11), pp. 1715–1722. doi: 10.2460/javma.233.11.1715. Indexed abstract: https://pubmed.ncbi.nlm.nih.gov/19046028/ (Accessed: 27 September 2026).</w:t>
+        <w:t>Lord, L.K., Reider, L., Herron, M.E. and Graszak, K. (2008) 'Health and behavior problems in dogs and cats one week and one month after adoption from animal shelters', Journal of the American Veterinary Medical Association, 233(11), pp. 1715–1722. doi: 10.2460/javma.233.11.1715.</w:t>
       </w:r>
     </w:p>
     <w:p>
@@ -5077,7 +4605,7 @@
           <w:color w:val="B22222"/>
           <w:sz w:val="19"/>
         </w:rPr>
-        <w:t>Ministry of the Environment (2006) Guidelines for Supporting Animal Rehoming [譲渡支援のためのガイドライン, in Japanese]. Available at: https://www.env.go.jp/nature/dobutsu/aigo/2_data/pamph/support/02.pdf (Accessed: 27 September 2026).</w:t>
+        <w:t>Ministry of the Environment (2006) Guidelines for finding a new owner [in Japanese]. Available at: https://www.env.go.jp/nature/dobutsu/aigo/2_data/pamph/support/02.pdf (Accessed: 24 September 2026).</w:t>
       </w:r>
     </w:p>
     <w:p>
@@ -5092,7 +4620,7 @@
           <w:color w:val="B22222"/>
           <w:sz w:val="19"/>
         </w:rPr>
-        <w:t>Ministry of the Environment (2021) Guidelines for Preventing Animal Hoarding and Excessive Animal Ownership [English partial translation of the Japanese guidance issued March 2021]. Available at: https://www.env.go.jp/nature/dobutsu/aigo/2_data/pamph/r0409/guideline.pdf (Accessed: 27 September 2026).</w:t>
+        <w:t>Ministry of the Environment (2022) Guidelines on measures to address animal hoarding [in Japanese]. Available at: https://www.env.go.jp/nature/dobutsu/aigo/2_data/pamph/r0409/guideline.pdf (Accessed: 24 September 2026).</w:t>
       </w:r>
     </w:p>
     <w:p>
@@ -5107,7 +4635,7 @@
           <w:color w:val="B22222"/>
           <w:sz w:val="19"/>
         </w:rPr>
-        <w:t>Ministry of the Environment (2025) Intake and disposition of dogs and cats [in Japanese]. Available at: https://www.env.go.jp/nature/dobutsu/aigo/2_data/statistics/dog-cat.html (Accessed: 27 September 2026).</w:t>
+        <w:t>Ministry of the Environment (2025) Intake and disposition of dogs and cats [in Japanese]. Available at: https://www.env.go.jp/nature/dobutsu/aigo/2_data/statistics/dog-cat.html (Accessed: 24 September 2026).</w:t>
       </w:r>
     </w:p>
     <w:p>
@@ -5152,7 +4680,7 @@
           <w:color w:val="B22222"/>
           <w:sz w:val="19"/>
         </w:rPr>
-        <w:t>Parasuraman, R. and Manzey, D.H. (2010) 'Complacency and bias in human use of automation: an attentional integration', Human Factors, 52(3), pp. 381–410. doi: 10.1177/0018720810376055. Indexed abstract: https://pubmed.ncbi.nlm.nih.gov/21077562/ (Accessed: 27 September 2026).</w:t>
+        <w:t>Parasuraman, R. and Manzey, D.H. (2010) 'Complacency and bias in human use of automation', Human Factors, 52(3), pp. 381–410. doi: 10.1177/0018720810376055.</w:t>
       </w:r>
     </w:p>
     <w:p>
@@ -5167,7 +4695,7 @@
           <w:color w:val="B22222"/>
           <w:sz w:val="19"/>
         </w:rPr>
-        <w:t>Powell, L. et al. (2022) 'Returning a Shelter Dog: The Role of Owner Expectations and Dog Behavior', Animals, 12(9), 1053. doi: 10.3390/ani12091053. Full text: https://pmc.ncbi.nlm.nih.gov/articles/PMC9100056/ (Accessed: 27 September 2026).</w:t>
+        <w:t>Powell, L. et al. (2022) 'Returning a Shelter Dog: The Role of Owner Expectations and Dog Behavior', Animals, 12(9), 1053. doi: 10.3390/ani12091053.</w:t>
       </w:r>
     </w:p>
     <w:p>
@@ -5182,7 +4710,7 @@
           <w:color w:val="B22222"/>
           <w:sz w:val="19"/>
         </w:rPr>
-        <w:t>Shelterluv (n.d.) Features. Available at: https://www.shelterluv.com/product/features/ (Accessed: 27 September 2026).</w:t>
+        <w:t>Shelterluv (n.d.) Features. Available at: https://www.shelterluv.com/product/features/ (Accessed: 24 September 2026).</w:t>
       </w:r>
     </w:p>
     <w:p>
@@ -14128,6 +13656,200 @@
         <w:spacing w:after="40"/>
       </w:pPr>
     </w:p>
+    <w:p>
+      <w:r>
+        <w:br w:type="page"/>
+      </w:r>
+    </w:p>
+    <w:p>
+      <w:pPr>
+        <w:pStyle w:val="Heading1"/>
+        <w:keepNext/>
+        <w:spacing w:after="200" w:line="278" w:lineRule="auto"/>
+      </w:pPr>
+      <w:r>
+        <w:rPr>
+          <w:rFonts w:ascii="Aptos" w:hAnsi="Aptos" w:eastAsia="Yu Gothic"/>
+          <w:color w:val="B22222"/>
+        </w:rPr>
+        <w:t>Appendix B Original Proposal design figures</w:t>
+      </w:r>
+    </w:p>
+    <w:p>
+      <w:pPr>
+        <w:keepNext w:val="0"/>
+        <w:spacing w:after="140" w:line="278" w:lineRule="auto"/>
+      </w:pPr>
+      <w:r>
+        <w:rPr>
+          <w:rFonts w:ascii="Aptos" w:hAnsi="Aptos" w:eastAsia="Yu Gothic"/>
+          <w:color w:val="B22222"/>
+        </w:rPr>
+        <w:t>The following three figures are retained as a record of the initial design, not as diagrams of the current implementation. In particular, the original applicant-ranking label and ten-step workflow have been superseded by an evidence-aware, six-stage process with no automatic acceptance, rejection or score-based ranking. Updated Figures 2–4 must be inserted before final submission.</w:t>
+      </w:r>
+    </w:p>
+    <w:p>
+      <w:pPr>
+        <w:spacing w:before="160" w:after="60"/>
+        <w:jc w:val="center"/>
+      </w:pPr>
+      <w:r>
+        <w:drawing>
+          <wp:inline xmlns:a="http://schemas.openxmlformats.org/drawingml/2006/main" xmlns:pic="http://schemas.openxmlformats.org/drawingml/2006/picture">
+            <wp:extent cx="6126480" cy="3230655"/>
+            <wp:docPr id="2" name="Picture 2"/>
+            <wp:cNvGraphicFramePr>
+              <a:graphicFrameLocks noChangeAspect="1"/>
+            </wp:cNvGraphicFramePr>
+            <a:graphic>
+              <a:graphicData uri="http://schemas.openxmlformats.org/drawingml/2006/picture">
+                <pic:pic>
+                  <pic:nvPicPr>
+                    <pic:cNvPr id="0" name="image.png"/>
+                    <pic:cNvPicPr/>
+                  </pic:nvPicPr>
+                  <pic:blipFill>
+                    <a:blip r:embed="rId11"/>
+                    <a:stretch>
+                      <a:fillRect/>
+                    </a:stretch>
+                  </pic:blipFill>
+                  <pic:spPr>
+                    <a:xfrm>
+                      <a:off x="0" y="0"/>
+                      <a:ext cx="6126480" cy="3230655"/>
+                    </a:xfrm>
+                    <a:prstGeom prst="rect"/>
+                  </pic:spPr>
+                </pic:pic>
+              </a:graphicData>
+            </a:graphic>
+          </wp:inline>
+        </w:drawing>
+      </w:r>
+    </w:p>
+    <w:p>
+      <w:pPr>
+        <w:pStyle w:val="Caption"/>
+        <w:keepNext w:val="0"/>
+        <w:spacing w:after="200" w:line="278" w:lineRule="auto"/>
+      </w:pPr>
+      <w:r>
+        <w:rPr>
+          <w:rFonts w:ascii="Aptos" w:hAnsi="Aptos" w:eastAsia="Yu Gothic"/>
+          <w:color w:val="B22222"/>
+        </w:rPr>
+        <w:t>Figure B1 Original Proposal system overview (superseded design). Source: author's own work.</w:t>
+      </w:r>
+    </w:p>
+    <w:p>
+      <w:pPr>
+        <w:spacing w:before="160" w:after="60"/>
+        <w:jc w:val="center"/>
+      </w:pPr>
+      <w:r>
+        <w:drawing>
+          <wp:inline xmlns:a="http://schemas.openxmlformats.org/drawingml/2006/main" xmlns:pic="http://schemas.openxmlformats.org/drawingml/2006/picture">
+            <wp:extent cx="6126480" cy="2365781"/>
+            <wp:docPr id="3" name="Picture 3"/>
+            <wp:cNvGraphicFramePr>
+              <a:graphicFrameLocks noChangeAspect="1"/>
+            </wp:cNvGraphicFramePr>
+            <a:graphic>
+              <a:graphicData uri="http://schemas.openxmlformats.org/drawingml/2006/picture">
+                <pic:pic>
+                  <pic:nvPicPr>
+                    <pic:cNvPr id="0" name="image.png"/>
+                    <pic:cNvPicPr/>
+                  </pic:nvPicPr>
+                  <pic:blipFill>
+                    <a:blip r:embed="rId12"/>
+                    <a:stretch>
+                      <a:fillRect/>
+                    </a:stretch>
+                  </pic:blipFill>
+                  <pic:spPr>
+                    <a:xfrm>
+                      <a:off x="0" y="0"/>
+                      <a:ext cx="6126480" cy="2365781"/>
+                    </a:xfrm>
+                    <a:prstGeom prst="rect"/>
+                  </pic:spPr>
+                </pic:pic>
+              </a:graphicData>
+            </a:graphic>
+          </wp:inline>
+        </w:drawing>
+      </w:r>
+    </w:p>
+    <w:p>
+      <w:pPr>
+        <w:pStyle w:val="Caption"/>
+        <w:keepNext w:val="0"/>
+        <w:spacing w:after="200" w:line="278" w:lineRule="auto"/>
+      </w:pPr>
+      <w:r>
+        <w:rPr>
+          <w:rFonts w:ascii="Aptos" w:hAnsi="Aptos" w:eastAsia="Yu Gothic"/>
+          <w:color w:val="B22222"/>
+        </w:rPr>
+        <w:t>Figure B2 Original Proposal review workflow (superseded design). Source: author's own work.</w:t>
+      </w:r>
+    </w:p>
+    <w:p>
+      <w:pPr>
+        <w:spacing w:before="160" w:after="60"/>
+        <w:jc w:val="center"/>
+      </w:pPr>
+      <w:r>
+        <w:drawing>
+          <wp:inline xmlns:a="http://schemas.openxmlformats.org/drawingml/2006/main" xmlns:pic="http://schemas.openxmlformats.org/drawingml/2006/picture">
+            <wp:extent cx="6126480" cy="3280438"/>
+            <wp:docPr id="4" name="Picture 4"/>
+            <wp:cNvGraphicFramePr>
+              <a:graphicFrameLocks noChangeAspect="1"/>
+            </wp:cNvGraphicFramePr>
+            <a:graphic>
+              <a:graphicData uri="http://schemas.openxmlformats.org/drawingml/2006/picture">
+                <pic:pic>
+                  <pic:nvPicPr>
+                    <pic:cNvPr id="0" name="image.png"/>
+                    <pic:cNvPicPr/>
+                  </pic:nvPicPr>
+                  <pic:blipFill>
+                    <a:blip r:embed="rId13"/>
+                    <a:stretch>
+                      <a:fillRect/>
+                    </a:stretch>
+                  </pic:blipFill>
+                  <pic:spPr>
+                    <a:xfrm>
+                      <a:off x="0" y="0"/>
+                      <a:ext cx="6126480" cy="3280438"/>
+                    </a:xfrm>
+                    <a:prstGeom prst="rect"/>
+                  </pic:spPr>
+                </pic:pic>
+              </a:graphicData>
+            </a:graphic>
+          </wp:inline>
+        </w:drawing>
+      </w:r>
+    </w:p>
+    <w:p>
+      <w:pPr>
+        <w:pStyle w:val="Caption"/>
+        <w:keepNext w:val="0"/>
+        <w:spacing w:after="200" w:line="278" w:lineRule="auto"/>
+      </w:pPr>
+      <w:r>
+        <w:rPr>
+          <w:rFonts w:ascii="Aptos" w:hAnsi="Aptos" w:eastAsia="Yu Gothic"/>
+          <w:color w:val="B22222"/>
+        </w:rPr>
+        <w:t>Figure B3 Original Proposal comparison design (superseded design). Source: author's own work.</w:t>
+      </w:r>
+    </w:p>
     <w:sectPr>
       <w:pgSz w:w="12240" w:h="15840"/>
       <w:pgMar w:top="1080" w:right="1152" w:bottom="1008" w:left="1152" w:header="720" w:footer="720" w:gutter="0"/>

</xml_diff>

<commit_message>
Align evaluation evidence and verify adoption journey
</commit_message>
<xml_diff>
--- a/docs/reports/Final_Report_Integrated_Draft_EN.docx
+++ b/docs/reports/Final_Report_Integrated_Draft_EN.docx
@@ -88,16 +88,9 @@
       </w:pPr>
       <w:r>
         <w:rPr>
-          <w:rFonts w:ascii="Aptos" w:hAnsi="Aptos" w:eastAsia="Yu Gothic"/>
-          <w:color w:val="B22222"/>
+          <w:color w:val="FF0000"/>
         </w:rPr>
-        <w:t>This study develops and evaluates a risk-aware review interface for dog and cat rehoming in Japan. The prototype links animal-specific care requirements to applicant plans, verification states and a staged human decision. A scenario-based comparison of a basic profile view and a supported review view is designed to test review time, recognition of critical risks and quality of written reasons, including possible over-reliance on scores. The current software and synthetic cases establish feasibility; participant results and real-world adoption outcomes have not yet been obtained. The report preserves the original problem, design and evaluation proposal while distinguishing implemented functions from hypotheses awaiting evaluation.</w:t>
-      </w:r>
-      <w:r>
-        <w:rPr>
-          <w:color w:val="C00000"/>
-        </w:rPr>
-        <w:t xml:space="preserve"> The operating model preserves direct communication between the adopter and the rehomer, while PawMatch reviewers and administrators manage the more burdensome screening, evidence and workflow tasks.</w:t>
+        <w:t>This study develops and evaluates a risk-aware review interface for dog and cat rehoming in Japan. The prototype links animal-specific care requirements to applicant plans, verification states and a staged human decision. A scenario comparison between Application information only and With PawMatch review support examines recognition of important risks, quality of written reasons, information clarity, perceived usefulness and possible over-reliance on scores. Elapsed screen time is retained only as a secondary contextual observation because a prototype task cannot reproduce follow-up communication and document checks in a real adoption review. The current software and synthetic cases establish feasibility; participant results and real-world adoption outcomes have not yet been obtained. The report preserves the original problem, design and evaluation proposal while distinguishing implemented functions from hypotheses awaiting evaluation. The operating model preserves direct communication between the adopter and the rehomer, while PawMatch reviewers and administrators manage the more burdensome screening, evidence and workflow tasks.</w:t>
       </w:r>
     </w:p>
     <w:p>
@@ -452,10 +445,9 @@
       </w:pPr>
       <w:r>
         <w:rPr>
-          <w:rFonts w:ascii="Aptos" w:hAnsi="Aptos" w:eastAsia="Yu Gothic"/>
-          <w:color w:val="B22222"/>
+          <w:color w:val="FF0000"/>
         </w:rPr>
-        <w:t>Existing work helps adopters understand the journey and organisations manage cases. This study asks a narrower unanswered question: when animal needs, applicant plans and pending checks appear together, can a reviewer identify important risks and explain the next action without relying only on the score? We will compare two views of the same synthetic cases. This will test the review process, not superiority over other products or an increase in real adoptions.</w:t>
+        <w:t>Existing work helps adopters understand the journey and organisations manage cases. This study asks a narrower unanswered question: when animal needs, applicant plans and pending checks appear together, can a reviewer identify important risks and explain the next action without relying only on the score? The study does not claim superiority over existing products or an increase in real adoptions.</w:t>
       </w:r>
     </w:p>
     <w:p>
@@ -480,10 +472,9 @@
       </w:pPr>
       <w:r>
         <w:rPr>
-          <w:rFonts w:ascii="Aptos" w:hAnsi="Aptos" w:eastAsia="Yu Gothic"/>
-          <w:color w:val="B22222"/>
+          <w:color w:val="FF0000"/>
         </w:rPr>
-        <w:t>The research questions (RQs) translate the aim into three observable comparisons between the basic and supported views:</w:t>
+        <w:t>The research questions (RQs) organise three observable differences when the same case is reviewed with Application information only and With PawMatch review support:</w:t>
       </w:r>
     </w:p>
     <w:p>
@@ -493,10 +484,9 @@
       </w:pPr>
       <w:r>
         <w:rPr>
-          <w:rFonts w:ascii="Aptos" w:hAnsi="Aptos" w:eastAsia="Yu Gothic"/>
-          <w:color w:val="B22222"/>
+          <w:color w:val="FF0000"/>
         </w:rPr>
-        <w:t>• RQ1 — Speed and safety: Can reviewers decide the appropriate next step more quickly while still finding the important risks specified in advance for each case? Measure review time together with critical-risk detection, not speed alone.</w:t>
+        <w:t>• RQ1 — Noticing important checks: Can participants connect the animal's care needs with the applicant's plan and identify the predefined important risks, missing evidence and appropriate next checks?</w:t>
       </w:r>
     </w:p>
     <w:p>
@@ -506,10 +496,9 @@
       </w:pPr>
       <w:r>
         <w:rPr>
-          <w:rFonts w:ascii="Aptos" w:hAnsi="Aptos" w:eastAsia="Yu Gothic"/>
-          <w:color w:val="B22222"/>
+          <w:color w:val="FF0000"/>
         </w:rPr>
-        <w:t>• RQ2 — Explainability: Can reviewers state why they made that decision and which facts still need to be checked? Compare written reasons and follow-up checks with a predefined case rubric.</w:t>
+        <w:t>• RQ2 — Explaining the decision: Can participants explain why they selected a candidate and what must be checked next? Researcher coding of written answers is combined with task-level 1–5 ratings of usefulness, information clarity and confidence in explaining the decision.</w:t>
       </w:r>
     </w:p>
     <w:p>
@@ -519,10 +508,9 @@
       </w:pPr>
       <w:r>
         <w:rPr>
-          <w:rFonts w:ascii="Aptos" w:hAnsi="Aptos" w:eastAsia="Yu Gothic"/>
-          <w:color w:val="B22222"/>
+          <w:color w:val="FF0000"/>
         </w:rPr>
-        <w:t>• RQ3 — Over-reliance: If a provisional score is high but housing or care evidence is still missing, do reviewers notice the pending check rather than advancing the case solely because of the number?</w:t>
+        <w:t>• RQ3 — Avoiding over-reliance: When a provisional score is high but housing or care evidence is still missing, do participants notice the pending check rather than advancing solely because of the number? Critical misses are considered together with self-reported reliance on screen conclusions and scores.</w:t>
       </w:r>
     </w:p>
     <w:p>
@@ -709,10 +697,9 @@
       </w:pPr>
       <w:r>
         <w:rPr>
-          <w:rFonts w:ascii="Aptos" w:hAnsi="Aptos" w:eastAsia="Yu Gothic"/>
-          <w:color w:val="000000"/>
+          <w:color w:val="FF0000"/>
         </w:rPr>
-        <w:t>For evaluation purposes, the prototype will include two review modes. The first will be a baseline applicant review screen that presents synthetic animal and adopter profiles in a simple list or profile format. The second will be the proposed risk-aware interface, which adds suitability scores, risk flags, verification statuses, and recommended next actions. This comparison will allow the project to examine whether the proposed design provides value beyond simply displaying applicant information.</w:t>
+        <w:t>The evaluation uses two review screens. Application information only presents the same animal and applicant facts and verification states. With PawMatch review support adds the suitability score, reasons for the score, risks and suggested next checks. Candidate order and source facts remain identical, allowing the study to compare decisions and explanations when review support is added.</w:t>
       </w:r>
     </w:p>
     <w:p>
@@ -1680,10 +1667,9 @@
       </w:pPr>
       <w:r>
         <w:rPr>
-          <w:rFonts w:ascii="Aptos" w:hAnsi="Aptos" w:eastAsia="Yu Gothic"/>
-          <w:color w:val="000000"/>
+          <w:color w:val="FF0000"/>
         </w:rPr>
-        <w:t>The evaluation will use scenario-based user testing with synthetic animal and adopter profiles. The purpose is to assess whether the prototype supports the review process, rather than merely demonstrating that the software functions technically. Participants will review the same rehoming scenarios using both a baseline interface and the proposed risk-aware interface.</w:t>
+        <w:t>The evaluation uses scenario-based tasks with synthetic animal and applicant profiles. Its purpose is not only to demonstrate technical operation, but to examine whether the prototype helps participants understand and explain information needed for review. Participants consider the same rehoming cases using Application information only and With PawMatch review support.</w:t>
       </w:r>
     </w:p>
     <w:p>
@@ -1693,10 +1679,9 @@
       </w:pPr>
       <w:r>
         <w:rPr>
-          <w:rFonts w:ascii="Aptos" w:hAnsi="Aptos" w:eastAsia="Yu Gothic"/>
-          <w:color w:val="000000"/>
+          <w:color w:val="FF0000"/>
         </w:rPr>
-        <w:t>The baseline interface will show applicant information in a simple profile or list format. The proposed interface will add weighted suitability scores, risk flags, verification statuses, and recommended next actions. Participants will be asked to identify the applicant who should proceed to the next review stage, identify applicants requiring additional checks, list relevant risks, and explain their decision.</w:t>
+        <w:t>Application information only presents applicant facts and verification states in a simple profile. With PawMatch review support adds a weighted suitability score, its explanation, risks and suggested next checks. For each candidate, participants record an action, select a priority candidate, identify risks, explain their decision and propose next checks.</w:t>
       </w:r>
     </w:p>
     <w:p>
@@ -1719,10 +1704,9 @@
       </w:pPr>
       <w:r>
         <w:rPr>
-          <w:rFonts w:ascii="Aptos" w:hAnsi="Aptos" w:eastAsia="Yu Gothic"/>
-          <w:color w:val="000000"/>
+          <w:color w:val="FF0000"/>
         </w:rPr>
-        <w:t>The evaluation will measure review time, number of relevant risks identified, consistency of applicant prioritisation, clarity of decision explanations, perceived usefulness, clarity of risk flags and verification statuses, and possible over-reliance on scores. These measures will help determine whether the risk-aware interface improves efficiency, consistency, and explainability compared with the baseline interface.</w:t>
+        <w:t>Primary measures are recall of predefined important risks, clarity of the written decision, appropriate next checks, perceived usefulness, information clarity, confidence in explaining the decision and possible over-reliance on screen conclusions or scores. Task-level 1–5 ratings and written answers are compared within the same participant and case. Elapsed screen time is also recorded, but is secondary because it excludes the follow-up communication and document checks required in real rehoming.</w:t>
       </w:r>
     </w:p>
     <w:p>
@@ -1732,10 +1716,9 @@
       </w:pPr>
       <w:r>
         <w:rPr>
-          <w:rFonts w:ascii="Aptos" w:hAnsi="Aptos" w:eastAsia="Yu Gothic"/>
-          <w:color w:val="000000"/>
+          <w:color w:val="FF0000"/>
         </w:rPr>
-        <w:t>Figure 4 shows the evaluation design. Participants will review the same synthetic rehoming scenario using two different interfaces: a baseline applicant list and the proposed risk-aware interface. The results will then be compared using measures such as review time, number of risks identified, clarity of decision explanation and perceived usefulness.</w:t>
+        <w:t>Figure 4 shows the evaluation design. Participants consider the same synthetic case using Application information only and With PawMatch review support. Important-risk recall, written reasons, next checks and task-level ratings are compared. Display order alternates AB/BA; elapsed time is retained as contextual information.</w:t>
       </w:r>
     </w:p>
     <w:p>
@@ -1746,10 +1729,9 @@
       </w:pPr>
       <w:r>
         <w:rPr>
-          <w:rFonts w:ascii="Aptos" w:hAnsi="Aptos" w:eastAsia="Yu Gothic"/>
-          <w:color w:val="B22222"/>
+          <w:color w:val="FF0000"/>
         </w:rPr>
-        <w:t>Figure 4 Planned comparison design: AB/BA order, repeated-case learning caveat, review time and critical-risk detection. The original Proposal comparison figure is preserved in Appendix B. [INSERT UPDATED LEGIBLE DIAGRAM]</w:t>
+        <w:t>Figure 4 Planned comparison design: AB/BA order, repeated-case learning caveat, important-risk recall, written reasons and task-level ratings. The original Proposal comparison figure is preserved in Appendix B. [INSERT UPDATED LEGIBLE DIAGRAM]</w:t>
       </w:r>
     </w:p>
     <w:p>
@@ -1773,10 +1755,9 @@
       </w:pPr>
       <w:r>
         <w:rPr>
-          <w:rFonts w:ascii="Aptos" w:hAnsi="Aptos" w:eastAsia="Yu Gothic"/>
-          <w:color w:val="B22222"/>
+          <w:color w:val="FF0000"/>
         </w:rPr>
-        <w:t>This formative evaluation targets five consenting adult participants. The Office for Health Improvement and Disparities (2020) recommends five to six people for qualitative usability testing, which is intended to identify usability issues in tasks. By contrast, the GOV.UK User Research Community (2018) advises recruiting 30 to 60 actual or likely users for service-wide usability benchmarking. Five participants are a pragmatic choice for this individual project, not a powered sample or a service benchmark. Recorded times and risk counts will be reported descriptively alongside observed difficulties and written reasons; they cannot establish statistical significance, population performance or a real-world reduction in screening time.</w:t>
+        <w:t>This formative evaluation targets five consenting adult participants. The Office for Health Improvement and Disparities (2020) recommends five to six people for qualitative usability testing intended to identify problems in tasks. By contrast, the GOV.UK User Research Community (2018) advises recruiting 30 to 60 actual or likely users for service-wide usability benchmarking. Five participants are a pragmatic choice for this individual project, not a powered sample or a service benchmark. Participant-level observations of important risks, written reasons and task ratings will be primary. The study will not claim statistical significance, population performance or a real-world reduction in review time.</w:t>
       </w:r>
     </w:p>
     <w:p>
@@ -1786,10 +1767,9 @@
       </w:pPr>
       <w:r>
         <w:rPr>
-          <w:rFonts w:ascii="Aptos" w:hAnsi="Aptos" w:eastAsia="Yu Gothic"/>
-          <w:color w:val="B22222"/>
+          <w:color w:val="FF0000"/>
         </w:rPr>
-        <w:t>Each participant will see two selected synthetic cases in both modes, making four tasks. AB and BA display orders will be alternated; with five people the split is necessarily three versus two, and repeating cases may teach participants what to look for. Per-person differences in critical risks found and review time will be shown together with concrete usability observations, acceptable next steps, written reasons, perceived clarity and possible high-score over-reliance. Free text will be coded against a predefined rubric, with denominators, missing data, order and relevant experience disclosed. The study will look for design problems and promising signals, not estimate an average treatment effect. If no animal-welfare practitioner participates, the findings cannot validate use by rehoming organisations.</w:t>
+        <w:t>Each participant will see two selected synthetic cases in both modes, making four tasks. AB and BA display orders will be alternated; with five people the split is necessarily three versus two, and repeating cases may teach participants what to look for. Within each participant, the study compares important-risk recall, concrete usability problems, appropriate next checks, written reasons, usefulness, clarity, confidence and reliance on the screen. Free text will be coded against a predefined rubric, with denominators, missing data, order and relevant experience disclosed. Elapsed time will be reported only as contextual information alongside interruptions. The study will look for design problems and promising signals, not estimate an average treatment effect. If no animal-welfare practitioner participates, the findings cannot validate use by rehoming organisations.</w:t>
       </w:r>
     </w:p>
     <w:p>
@@ -1799,10 +1779,9 @@
       </w:pPr>
       <w:r>
         <w:rPr>
-          <w:rFonts w:ascii="Aptos" w:hAnsi="Aptos" w:eastAsia="Yu Gothic"/>
-          <w:color w:val="B22222"/>
+          <w:color w:val="FF0000"/>
         </w:rPr>
-        <w:t>[PENDING VALIDATION: document written opt-in consent, recruitment, eligibility, participant count, dates, ethics approval if required, a frozen risk rubric and scoring weights. Do not substitute simulated participants or invented times.]</w:t>
+        <w:t>[PENDING VALIDATION: prepare participant information and record oral or email consent before participation; also retain the in-application consent confirmation. Document recruitment, eligibility, participant count, dates, ethics approval if required, the frozen risk rubric and scoring weights. Do not substitute simulated participants or invented times.]</w:t>
       </w:r>
     </w:p>
     <w:p>
@@ -2597,10 +2576,9 @@
       </w:pPr>
       <w:r>
         <w:rPr>
-          <w:rFonts w:ascii="Aptos" w:hAnsi="Aptos" w:eastAsia="Yu Gothic"/>
-          <w:color w:val="000000"/>
+          <w:color w:val="FF0000"/>
         </w:rPr>
-        <w:t>For Assessment 3, the final report, GitHub artefacts, and three-minute video will be prepared around one or two representative scenarios. The demonstration should show how risks that are less visible in the baseline screen become easier to identify in the risk-aware interface through scores, flags, verification statuses, and recommended actions.</w:t>
+        <w:t>For the final submission, the report, GitHub artefacts and three-minute video will be structured around one or two representative scenarios. The demonstration should show how risks that are difficult to organise from application information alone become easier to inspect through score explanations, warnings, verification states and suggested actions.</w:t>
       </w:r>
     </w:p>
     <w:p>
@@ -2663,10 +2641,9 @@
       </w:pPr>
       <w:r>
         <w:rPr>
-          <w:rFonts w:ascii="Aptos" w:hAnsi="Aptos" w:eastAsia="Yu Gothic"/>
-          <w:color w:val="B22222"/>
+          <w:color w:val="FF0000"/>
         </w:rPr>
-        <w:t>External adult testers must receive a clear information sheet and provide written opt-in consent before participating. Research records should use participant codes, support withdrawal and apply documented access, retention and deletion rules. The demo login is not production-grade identity verification; this study does not collect real identity documents, facial images or income evidence.</w:t>
+        <w:t>External adult testers must receive clear participant information and provide oral or email consent before participating. The application also records their confirmation of the study conditions. Research records use participant codes, support withdrawal and apply documented access, retention and deletion rules. The demo login is not production-grade identity verification; this study does not collect real identity documents, facial images or income evidence.</w:t>
       </w:r>
     </w:p>
     <w:p>
@@ -3267,9 +3244,9 @@
       </w:pPr>
       <w:r>
         <w:rPr>
-          <w:color w:val="C00000"/>
+          <w:color w:val="FF0000"/>
         </w:rPr>
-        <w:t>Table 4 reports checks run on the local working tree on 28 September 2026. The automated tests cover role boundaries, consultation ownership, synthetic-case consistency, separation of scores from verification, propagation of administrator weights, consent and withdrawal in study sessions, and human-gated final review. They verify selected software behaviour; they do not establish usability, fairness, animal-welfare impact or adoption outcomes.</w:t>
+        <w:t>Table 4 reports checks run on the local working tree on 28 September 2026. The 42 automated tests cover role boundaries, consultation ownership, synthetic-case consistency, separation of scores from verification, propagation of administrator weights, consent and withdrawal in study sessions, and human-gated final review. One complete Bella scenario also checks the adopter's enquiry, replies by the rehomer and PawMatch operations, suitability and document review, joint meeting, trial and final sign-off, adoption approval, and chronological dates for every completed stage. These checks establish selected software behaviour; they do not establish usability, fairness, animal-welfare impact or adoption outcomes.</w:t>
       </w:r>
     </w:p>
     <w:p>
@@ -3463,9 +3440,9 @@
             </w:pPr>
             <w:r>
               <w:rPr>
-                <w:color w:val="C00000"/>
+                <w:color w:val="FF0000"/>
               </w:rPr>
-              <w:t>39 passed; 0 failed</w:t>
+              <w:t>42 passed; 0 failed</w:t>
             </w:r>
           </w:p>
         </w:tc>
@@ -3492,12 +3469,9 @@
             </w:pPr>
             <w:r>
               <w:rPr>
-                <w:rFonts w:ascii="Aptos" w:hAnsi="Aptos" w:eastAsia="Yu Gothic"/>
-                <w:b w:val="0"/>
-                <w:color w:val="B22222"/>
-                <w:sz w:val="19"/>
+                <w:color w:val="FF0000"/>
               </w:rPr>
-              <w:t>Role, ownership, research-session, scoring and review-flow tests.</w:t>
+              <w:t>Roles, ownership, research sessions, scoring, review flow and an all-role completed adoption journey.</w:t>
             </w:r>
           </w:p>
         </w:tc>
@@ -3731,10 +3705,9 @@
       </w:pPr>
       <w:r>
         <w:rPr>
-          <w:rFonts w:ascii="Aptos" w:hAnsi="Aptos" w:eastAsia="Yu Gothic"/>
-          <w:color w:val="B22222"/>
+          <w:color w:val="FF0000"/>
         </w:rPr>
-        <w:t>[PENDING RESULTS: report invited, consented, started, completed and withdrawn counts; review-time distribution; critical risks detected out of opportunities; acceptable next steps; coded explanations; high-score over-reliance; missing data; and paired case-level comparisons. Quote participants only with consent. No participant outcome is claimed at this stage.]</w:t>
+        <w:t>[PENDING RESULTS: report invited, consented, started, completed and withdrawn counts; important-risk recall; appropriate next checks; coded explanations; usefulness; information clarity; confidence in explaining decisions; screen reliance; missing data; and paired case-level comparisons. Report elapsed time only as a secondary value excluding interrupted tasks. Quote participants only with consent. No participant outcome is claimed at this stage.]</w:t>
       </w:r>
     </w:p>
     <w:tbl>
@@ -3778,10 +3751,7 @@
             </w:pPr>
             <w:r>
               <w:rPr>
-                <w:rFonts w:ascii="Aptos" w:hAnsi="Aptos" w:eastAsia="Yu Gothic"/>
-                <w:b/>
-                <w:color w:val="B22222"/>
-                <w:sz w:val="19"/>
+                <w:color w:val="FF0000"/>
               </w:rPr>
               <w:t>Outcome</w:t>
             </w:r>
@@ -3812,12 +3782,9 @@
             </w:pPr>
             <w:r>
               <w:rPr>
-                <w:rFonts w:ascii="Aptos" w:hAnsi="Aptos" w:eastAsia="Yu Gothic"/>
-                <w:b/>
-                <w:color w:val="B22222"/>
-                <w:sz w:val="19"/>
+                <w:color w:val="FF0000"/>
               </w:rPr>
-              <w:t>Basic view</w:t>
+              <w:t>Application information only</w:t>
             </w:r>
           </w:p>
         </w:tc>
@@ -3846,12 +3813,9 @@
             </w:pPr>
             <w:r>
               <w:rPr>
-                <w:rFonts w:ascii="Aptos" w:hAnsi="Aptos" w:eastAsia="Yu Gothic"/>
-                <w:b/>
-                <w:color w:val="B22222"/>
-                <w:sz w:val="19"/>
+                <w:color w:val="FF0000"/>
               </w:rPr>
-              <w:t>Supported view</w:t>
+              <w:t>With PawMatch review support</w:t>
             </w:r>
           </w:p>
         </w:tc>
@@ -3883,12 +3847,9 @@
             </w:pPr>
             <w:r>
               <w:rPr>
-                <w:rFonts w:ascii="Aptos" w:hAnsi="Aptos" w:eastAsia="Yu Gothic"/>
-                <w:b w:val="0"/>
-                <w:color w:val="B22222"/>
-                <w:sz w:val="19"/>
+                <w:color w:val="FF0000"/>
               </w:rPr>
-              <w:t>Completed reviews</w:t>
+              <w:t>Completed tasks</w:t>
             </w:r>
           </w:p>
         </w:tc>
@@ -3915,12 +3876,9 @@
             </w:pPr>
             <w:r>
               <w:rPr>
-                <w:rFonts w:ascii="Aptos" w:hAnsi="Aptos" w:eastAsia="Yu Gothic"/>
-                <w:b w:val="0"/>
-                <w:color w:val="B22222"/>
-                <w:sz w:val="19"/>
+                <w:color w:val="FF0000"/>
               </w:rPr>
-              <w:t>[n]</w:t>
+              <w:t>[n / planned tasks]</w:t>
             </w:r>
           </w:p>
         </w:tc>
@@ -3947,12 +3905,9 @@
             </w:pPr>
             <w:r>
               <w:rPr>
-                <w:rFonts w:ascii="Aptos" w:hAnsi="Aptos" w:eastAsia="Yu Gothic"/>
-                <w:b w:val="0"/>
-                <w:color w:val="B22222"/>
-                <w:sz w:val="19"/>
+                <w:color w:val="FF0000"/>
               </w:rPr>
-              <w:t>[n]</w:t>
+              <w:t>[n / planned tasks]</w:t>
             </w:r>
           </w:p>
         </w:tc>
@@ -3984,12 +3939,9 @@
             </w:pPr>
             <w:r>
               <w:rPr>
-                <w:rFonts w:ascii="Aptos" w:hAnsi="Aptos" w:eastAsia="Yu Gothic"/>
-                <w:b w:val="0"/>
-                <w:color w:val="B22222"/>
-                <w:sz w:val="19"/>
+                <w:color w:val="FF0000"/>
               </w:rPr>
-              <w:t>Review time</w:t>
+              <w:t>Important-risk recall</w:t>
             </w:r>
           </w:p>
         </w:tc>
@@ -4016,12 +3968,9 @@
             </w:pPr>
             <w:r>
               <w:rPr>
-                <w:rFonts w:ascii="Aptos" w:hAnsi="Aptos" w:eastAsia="Yu Gothic"/>
-                <w:b w:val="0"/>
-                <w:color w:val="B22222"/>
-                <w:sz w:val="19"/>
+                <w:color w:val="FF0000"/>
               </w:rPr>
-              <w:t>[median and spread]</w:t>
+              <w:t>[detected / opportunities]</w:t>
             </w:r>
           </w:p>
         </w:tc>
@@ -4048,12 +3997,9 @@
             </w:pPr>
             <w:r>
               <w:rPr>
-                <w:rFonts w:ascii="Aptos" w:hAnsi="Aptos" w:eastAsia="Yu Gothic"/>
-                <w:b w:val="0"/>
-                <w:color w:val="B22222"/>
-                <w:sz w:val="19"/>
+                <w:color w:val="FF0000"/>
               </w:rPr>
-              <w:t>[median and spread]</w:t>
+              <w:t>[detected / opportunities]</w:t>
             </w:r>
           </w:p>
         </w:tc>
@@ -4085,12 +4031,9 @@
             </w:pPr>
             <w:r>
               <w:rPr>
-                <w:rFonts w:ascii="Aptos" w:hAnsi="Aptos" w:eastAsia="Yu Gothic"/>
-                <w:b w:val="0"/>
-                <w:color w:val="B22222"/>
-                <w:sz w:val="19"/>
+                <w:color w:val="FF0000"/>
               </w:rPr>
-              <w:t>Critical risks found</w:t>
+              <w:t>Clarity of written reasons</w:t>
             </w:r>
           </w:p>
         </w:tc>
@@ -4117,12 +4060,9 @@
             </w:pPr>
             <w:r>
               <w:rPr>
-                <w:rFonts w:ascii="Aptos" w:hAnsi="Aptos" w:eastAsia="Yu Gothic"/>
-                <w:b w:val="0"/>
-                <w:color w:val="B22222"/>
-                <w:sz w:val="19"/>
+                <w:color w:val="FF0000"/>
               </w:rPr>
-              <w:t>[count / opportunities]</w:t>
+              <w:t>[mean 0–3; coded n]</w:t>
             </w:r>
           </w:p>
         </w:tc>
@@ -4149,12 +4089,9 @@
             </w:pPr>
             <w:r>
               <w:rPr>
-                <w:rFonts w:ascii="Aptos" w:hAnsi="Aptos" w:eastAsia="Yu Gothic"/>
-                <w:b w:val="0"/>
-                <w:color w:val="B22222"/>
-                <w:sz w:val="19"/>
+                <w:color w:val="FF0000"/>
               </w:rPr>
-              <w:t>[count / opportunities]</w:t>
+              <w:t>[mean 0–3; coded n]</w:t>
             </w:r>
           </w:p>
         </w:tc>
@@ -4186,12 +4123,9 @@
             </w:pPr>
             <w:r>
               <w:rPr>
-                <w:rFonts w:ascii="Aptos" w:hAnsi="Aptos" w:eastAsia="Yu Gothic"/>
-                <w:b w:val="0"/>
-                <w:color w:val="B22222"/>
-                <w:sz w:val="19"/>
+                <w:color w:val="FF0000"/>
               </w:rPr>
-              <w:t>Acceptable next steps</w:t>
+              <w:t>Usefulness, clarity and confidence</w:t>
             </w:r>
           </w:p>
         </w:tc>
@@ -4218,12 +4152,9 @@
             </w:pPr>
             <w:r>
               <w:rPr>
-                <w:rFonts w:ascii="Aptos" w:hAnsi="Aptos" w:eastAsia="Yu Gothic"/>
-                <w:b w:val="0"/>
-                <w:color w:val="B22222"/>
-                <w:sz w:val="19"/>
+                <w:color w:val="FF0000"/>
               </w:rPr>
-              <w:t>[count / total]</w:t>
+              <w:t>[each mean 1–5]</w:t>
             </w:r>
           </w:p>
         </w:tc>
@@ -4250,12 +4181,9 @@
             </w:pPr>
             <w:r>
               <w:rPr>
-                <w:rFonts w:ascii="Aptos" w:hAnsi="Aptos" w:eastAsia="Yu Gothic"/>
-                <w:b w:val="0"/>
-                <w:color w:val="B22222"/>
-                <w:sz w:val="19"/>
+                <w:color w:val="FF0000"/>
               </w:rPr>
-              <w:t>[count / total]</w:t>
+              <w:t>[each mean 1–5]</w:t>
             </w:r>
           </w:p>
         </w:tc>
@@ -4287,12 +4215,9 @@
             </w:pPr>
             <w:r>
               <w:rPr>
-                <w:rFonts w:ascii="Aptos" w:hAnsi="Aptos" w:eastAsia="Yu Gothic"/>
-                <w:b w:val="0"/>
-                <w:color w:val="B22222"/>
-                <w:sz w:val="19"/>
+                <w:color w:val="FF0000"/>
               </w:rPr>
-              <w:t>Score over-reliance</w:t>
+              <w:t>Reliance on screen conclusions or scores</w:t>
             </w:r>
           </w:p>
         </w:tc>
@@ -4319,12 +4244,9 @@
             </w:pPr>
             <w:r>
               <w:rPr>
-                <w:rFonts w:ascii="Aptos" w:hAnsi="Aptos" w:eastAsia="Yu Gothic"/>
-                <w:b w:val="0"/>
-                <w:color w:val="B22222"/>
-                <w:sz w:val="19"/>
+                <w:color w:val="FF0000"/>
               </w:rPr>
-              <w:t>[count / relevant cases]</w:t>
+              <w:t>[mean 1–5]</w:t>
             </w:r>
           </w:p>
         </w:tc>
@@ -4351,12 +4273,9 @@
             </w:pPr>
             <w:r>
               <w:rPr>
-                <w:rFonts w:ascii="Aptos" w:hAnsi="Aptos" w:eastAsia="Yu Gothic"/>
-                <w:b w:val="0"/>
-                <w:color w:val="B22222"/>
-                <w:sz w:val="19"/>
+                <w:color w:val="FF0000"/>
               </w:rPr>
-              <w:t>[count / relevant cases]</w:t>
+              <w:t>[mean 1–5]</w:t>
             </w:r>
           </w:p>
         </w:tc>
@@ -4375,10 +4294,9 @@
       </w:pPr>
       <w:r>
         <w:rPr>
-          <w:rFonts w:ascii="Aptos" w:hAnsi="Aptos" w:eastAsia="Yu Gothic"/>
-          <w:color w:val="B22222"/>
+          <w:color w:val="FF0000"/>
         </w:rPr>
-        <w:t>Figure 7 Planned results figure: paired review time and critical-risk recall by mode, with denominators and uncertainty shown. [INSERT ONLY AFTER REAL PARTICIPANT DATA ARE COLLECTED]</w:t>
+        <w:t>Figure 7 Planned results figure: within-participant, same-case differences in important-risk recall, usefulness, information clarity, confidence and screen reliance, with denominators and missing data shown. Elapsed time will appear only in a secondary figure or note. [INSERT ONLY AFTER REAL PARTICIPANT DATA ARE COLLECTED]</w:t>
       </w:r>
     </w:p>
     <w:p>
@@ -4402,10 +4320,9 @@
       </w:pPr>
       <w:r>
         <w:rPr>
-          <w:rFonts w:ascii="Aptos" w:hAnsi="Aptos" w:eastAsia="Yu Gothic"/>
-          <w:color w:val="B22222"/>
+          <w:color w:val="FF0000"/>
         </w:rPr>
-        <w:t>The anticipated methodological contribution is an inspectable comparison of two review displays on the same synthetic cases. With five self-selected participants, researcher-written cases and scoring rules, learning between repeated tasks and differences in domain experience can strongly influence every observation. Even a unanimous pattern would be a finding about these tasks and people, not a precise estimate for rehoming organisations. Faster review would not be beneficial if critical risks are missed; better detection may carry a time cost. If scores encourage unjustified advancement, the design should be revised. Real placement success, return and animal welfare require field follow-up and are outside this short evaluation.</w:t>
+        <w:t>The anticipated methodological contribution is an inspectable comparison of two review screens on the same synthetic cases. With five self-selected participants, researcher-written cases and scoring rules, learning between repeated tasks and differences in domain experience can strongly influence every observation. Even a unanimous pattern would be a finding about these tasks and people, not a precise estimate for rehoming organisations. Improved risk recall or explanations would not by itself establish operational effectiveness. If scores encourage unjustified advancement or greater reliance on the screen, the design should be revised. Elapsed time excludes real follow-up and is not primary evidence of efficiency. Real placement success, return and animal welfare require field follow-up and are outside this short evaluation.</w:t>
       </w:r>
     </w:p>
     <w:p>
@@ -4442,10 +4359,9 @@
       </w:pPr>
       <w:r>
         <w:rPr>
-          <w:rFonts w:ascii="Aptos" w:hAnsi="Aptos" w:eastAsia="Yu Gothic"/>
-          <w:color w:val="000000"/>
+          <w:color w:val="FF0000"/>
         </w:rPr>
-        <w:t>The project also contributes an ethically low-risk evaluation design by using synthetic data and fictional scenarios. If the evaluation shows that the risk-aware interface improves risk identification, review consistency, decision explanation, or perceived usefulness compared with a baseline interface, it will provide evidence that this type of decision-support approach has potential value for safer and more transparent peer-to-peer rehoming workflows.</w:t>
+        <w:t>Synthetic data and scenarios also provide an ethically lower-risk evaluation design. If, compared with Application information only, review support shows a consistent improvement in important-risk recall, written reasons, next checks, information clarity or perceived usefulness without increasing critical misses or screen reliance, the findings can provide evidence of potential value for safer and more transparent rehoming workflows. They will not directly establish real adoption outcomes.</w:t>
       </w:r>
     </w:p>
     <w:p>
@@ -4483,9 +4399,9 @@
       </w:pPr>
       <w:r>
         <w:rPr>
-          <w:color w:val="C00000"/>
+          <w:color w:val="FF0000"/>
         </w:rPr>
-        <w:t>This study advances a specific design hypothesis: rehoming review may be simplified not by omitting checks, but by bringing each animal's care needs, the applicant's plan, outstanding evidence and the next human action into one traceable decision. The prototype implements that workflow, and the 39 passing automated tests establish selected functional properties. They do not show that people make better decisions with it.</w:t>
+        <w:t>This study advances a specific design hypothesis: rehoming review may be simplified not by omitting checks, but by bringing each animal's care needs, the applicant's plan, outstanding evidence and the next human action into one traceable decision. The prototype implements that workflow, and 42 automated tests establish selected functional properties. A synthetic journey involving all four roles also completes one pet's enquiry through adoption approval while preserving permissions and chronological dates. These results do not show that people make better decisions with it.</w:t>
       </w:r>
     </w:p>
     <w:p>
@@ -4495,10 +4411,9 @@
       </w:pPr>
       <w:r>
         <w:rPr>
-          <w:rFonts w:ascii="Aptos" w:hAnsi="Aptos" w:eastAsia="Yu Gothic"/>
-          <w:color w:val="B22222"/>
+          <w:color w:val="FF0000"/>
         </w:rPr>
-        <w:t>The testable prediction is that, compared with a basic profile view, the supported view will help reviewers identify at least as many predefined critical risks, give more specific reasons and follow-up checks, and reach an appropriate next-step decision in less time. A high-scoring case with unresolved housing or care evidence tests whether the interface prevents numerical over-reliance. A time saving accompanied by more missed critical risks would refute a claim of safe simplification; improved detection with longer review would reveal an efficiency–safety trade-off. [After participant testing: insert the observed differences, denominators and uncertainty, including null or adverse results, and state which parts of the hypothesis survived.]</w:t>
+        <w:t>The testable prediction is that, compared with Application information only, With PawMatch review support will help participants identify at least as many predefined important risks and next checks, provide more specific reasons, and rate usefulness, clarity and confidence more highly. At the same time, high-scoring cases with unresolved housing or care evidence test whether critical misses or screen reliance increase. If improvement appears only for some people or cases, the report will state those conditions and counterexamples. Elapsed time is a secondary value and will not be interpreted as real-world review-time reduction. [After participant testing: insert differences, denominators, missing data and counterexamples, and state which parts of the prediction were supported.]</w:t>
       </w:r>
     </w:p>
     <w:p>

</xml_diff>

<commit_message>
Validate full adoption study journey
</commit_message>
<xml_diff>
--- a/docs/reports/Final_Report_Integrated_Draft_EN.docx
+++ b/docs/reports/Final_Report_Integrated_Draft_EN.docx
@@ -42,10 +42,9 @@
       </w:pPr>
       <w:r>
         <w:rPr>
-          <w:rFonts w:ascii="Aptos" w:hAnsi="Aptos" w:eastAsia="Yu Gothic"/>
-          <w:color w:val="000000"/>
+          <w:color w:val="C00000"/>
         </w:rPr>
-        <w:t>Serika Kawano | CSM500 | 27 September 2026</w:t>
+        <w:t>Serika Kawano | CSM500 | 29 September 2026</w:t>
       </w:r>
     </w:p>
     <w:p>
@@ -1523,10 +1522,115 @@
       </w:pPr>
       <w:r>
         <w:rPr>
-          <w:rFonts w:ascii="Aptos" w:hAnsi="Aptos" w:eastAsia="Yu Gothic"/>
-          <w:color w:val="B22222"/>
+          <w:color w:val="C00000"/>
         </w:rPr>
-        <w:t>Figure 6 Planned UI evidence: animal needs beside the applicant's care plan, verification state and reviewer action; include the progress grid and the basic-view comparator as separate labelled panels. [INSERT DATED SCREENSHOTS]</w:t>
+        <w:t>Figure 6 provides dated implementation evidence for the two operational views used to inspect the review workflow. The screenshots show the Japanese-language prototype; the same interface provides an English display option.</w:t>
+      </w:r>
+    </w:p>
+    <w:p>
+      <w:pPr>
+        <w:keepNext/>
+        <w:jc w:val="center"/>
+      </w:pPr>
+      <w:r>
+        <w:drawing>
+          <wp:inline xmlns:a="http://schemas.openxmlformats.org/drawingml/2006/main" xmlns:pic="http://schemas.openxmlformats.org/drawingml/2006/picture">
+            <wp:extent cx="5806440" cy="4032250"/>
+            <wp:docPr id="6" name="Picture 6"/>
+            <wp:cNvGraphicFramePr>
+              <a:graphicFrameLocks noChangeAspect="1"/>
+            </wp:cNvGraphicFramePr>
+            <a:graphic>
+              <a:graphicData uri="http://schemas.openxmlformats.org/drawingml/2006/picture">
+                <pic:pic>
+                  <pic:nvPicPr>
+                    <pic:cNvPr id="0" name="image.png"/>
+                    <pic:cNvPicPr/>
+                  </pic:nvPicPr>
+                  <pic:blipFill>
+                    <a:blip r:embed="rId17"/>
+                    <a:stretch>
+                      <a:fillRect/>
+                    </a:stretch>
+                  </pic:blipFill>
+                  <pic:spPr>
+                    <a:xfrm>
+                      <a:off x="0" y="0"/>
+                      <a:ext cx="5806440" cy="4032250"/>
+                    </a:xfrm>
+                    <a:prstGeom prst="rect"/>
+                  </pic:spPr>
+                </pic:pic>
+              </a:graphicData>
+            </a:graphic>
+          </wp:inline>
+        </w:drawing>
+      </w:r>
+    </w:p>
+    <w:p>
+      <w:pPr>
+        <w:pStyle w:val="Caption"/>
+        <w:keepLines/>
+        <w:jc w:val="center"/>
+      </w:pPr>
+      <w:r>
+        <w:rPr>
+          <w:color w:val="C00000"/>
+        </w:rPr>
+        <w:t>Figure 6a Review progress board showing one application per row, dated 29 September 2026. Source: author.</w:t>
+      </w:r>
+    </w:p>
+    <w:p>
+      <w:pPr>
+        <w:keepNext/>
+        <w:jc w:val="center"/>
+      </w:pPr>
+      <w:r>
+        <w:drawing>
+          <wp:inline xmlns:a="http://schemas.openxmlformats.org/drawingml/2006/main" xmlns:pic="http://schemas.openxmlformats.org/drawingml/2006/picture">
+            <wp:extent cx="5806440" cy="4032250"/>
+            <wp:docPr id="7" name="Picture 7"/>
+            <wp:cNvGraphicFramePr>
+              <a:graphicFrameLocks noChangeAspect="1"/>
+            </wp:cNvGraphicFramePr>
+            <a:graphic>
+              <a:graphicData uri="http://schemas.openxmlformats.org/drawingml/2006/picture">
+                <pic:pic>
+                  <pic:nvPicPr>
+                    <pic:cNvPr id="0" name="image.png"/>
+                    <pic:cNvPicPr/>
+                  </pic:nvPicPr>
+                  <pic:blipFill>
+                    <a:blip r:embed="rId16"/>
+                    <a:stretch>
+                      <a:fillRect/>
+                    </a:stretch>
+                  </pic:blipFill>
+                  <pic:spPr>
+                    <a:xfrm>
+                      <a:off x="0" y="0"/>
+                      <a:ext cx="5806440" cy="4032250"/>
+                    </a:xfrm>
+                    <a:prstGeom prst="rect"/>
+                  </pic:spPr>
+                </pic:pic>
+              </a:graphicData>
+            </a:graphic>
+          </wp:inline>
+        </w:drawing>
+      </w:r>
+    </w:p>
+    <w:p>
+      <w:pPr>
+        <w:pStyle w:val="Caption"/>
+        <w:keepLines/>
+        <w:jc w:val="center"/>
+      </w:pPr>
+      <w:r>
+        <w:rPr>
+          <w:color w:val="C00000"/>
+        </w:rPr>
+        <w:t>Figure 6b Case-level suitability review showing stage, role responsibilities and human-controlled actions, dated 29 September 2026. Source: author.</w:t>
       </w:r>
     </w:p>
     <w:p>
@@ -1770,6 +1874,89 @@
           <w:color w:val="FF0000"/>
         </w:rPr>
         <w:t>Each participant will see two selected synthetic cases in both modes, making four tasks. AB and BA display orders will be alternated; with five people the split is necessarily three versus two, and repeating cases may teach participants what to look for. Within each participant, the study compares important-risk recall, concrete usability problems, appropriate next checks, written reasons, usefulness, clarity, confidence and reliance on the screen. Free text will be coded against a predefined rubric, with denominators, missing data, order and relevant experience disclosed. Elapsed time will be reported only as contextual information alongside interruptions. The study will look for design problems and promising signals, not estimate an average treatment effect. If no animal-welfare practitioner participates, the findings cannot validate use by rehoming organisations.</w:t>
+      </w:r>
+    </w:p>
+    <w:p>
+      <w:pPr>
+        <w:pStyle w:val="Heading2"/>
+      </w:pPr>
+      <w:r>
+        <w:rPr>
+          <w:color w:val="C00000"/>
+        </w:rPr>
+        <w:t>6.1 Five-participant session procedure</w:t>
+      </w:r>
+    </w:p>
+    <w:p>
+      <w:pPr/>
+      <w:r>
+        <w:rPr>
+          <w:color w:val="C00000"/>
+        </w:rPr>
+        <w:t>Each participant completes one moderated session of approximately 35–45 minutes. The participant acts as a reviewer for the experimental tasks; the researcher-led all-role journey remains a technical verification and is not mixed with the participant outcome measures.</w:t>
+      </w:r>
+    </w:p>
+    <w:p>
+      <w:pPr/>
+      <w:r>
+        <w:rPr>
+          <w:color w:val="C00000"/>
+        </w:rPr>
+        <w:t>1. Recruit five consenting adults using pragmatic purposive sampling: where possible, include two current or previous pet carers, one person with rescue or rehoming experience, and two adults without specialist experience. Record relevant experience, but do not present the group as representative.</w:t>
+      </w:r>
+    </w:p>
+    <w:p>
+      <w:pPr/>
+      <w:r>
+        <w:rPr>
+          <w:color w:val="C00000"/>
+        </w:rPr>
+        <w:t>2. Send a short information sheet in advance and record oral or email consent. Assign participant codes P01–P05; do not collect identity documents, addresses or real adoption records.</w:t>
+      </w:r>
+    </w:p>
+    <w:p>
+      <w:pPr/>
+      <w:r>
+        <w:rPr>
+          <w:color w:val="C00000"/>
+        </w:rPr>
+        <w:t>3. Run the study on the researcher's computer or a prepared hosted instance. Start a fresh research session for each participant so that saved answers and workflow changes do not carry across participants.</w:t>
+      </w:r>
+    </w:p>
+    <w:p>
+      <w:pPr/>
+      <w:r>
+        <w:rPr>
+          <w:color w:val="C00000"/>
+        </w:rPr>
+        <w:t>4. Give a five-minute neutral orientation to the four roles and the meaning of scores, warnings and verification states. Do not explain the case risks that form the coding rubric.</w:t>
+      </w:r>
+    </w:p>
+    <w:p>
+      <w:pPr/>
+      <w:r>
+        <w:rPr>
+          <w:color w:val="C00000"/>
+        </w:rPr>
+        <w:t>5. Ask each participant to complete four tasks: two synthetic cases in both Application information only and With PawMatch review support. Alternate AB/BA order across participants (three in one order and two in the other). For every task, record the selected action, important risks, written reason and next checks.</w:t>
+      </w:r>
+    </w:p>
+    <w:p>
+      <w:pPr/>
+      <w:r>
+        <w:rPr>
+          <w:color w:val="C00000"/>
+        </w:rPr>
+        <w:t>6. Immediately after each task, collect 1–5 ratings for usefulness, information clarity, confidence in explaining the decision and reliance on the screen conclusion or score. The moderator records assistance, navigation errors, omitted critical risks and interruptions. Elapsed time is contextual only.</w:t>
+      </w:r>
+    </w:p>
+    <w:p>
+      <w:pPr/>
+      <w:r>
+        <w:rPr>
+          <w:color w:val="C00000"/>
+        </w:rPr>
+        <w:t>7. Finish with a short interview on confusing information, trust, missing evidence and role clarity. Code written answers against the frozen rubric before viewing aggregate ratings, then report participant-level denominators, medians, ranges, counterexamples and missing data without inferential significance claims.</w:t>
       </w:r>
     </w:p>
     <w:p>
@@ -3244,9 +3431,9 @@
       </w:pPr>
       <w:r>
         <w:rPr>
-          <w:color w:val="FF0000"/>
+          <w:color w:val="C00000"/>
         </w:rPr>
-        <w:t>Table 4 reports checks run on the local working tree on 28 September 2026. The 42 automated tests cover role boundaries, consultation ownership, synthetic-case consistency, separation of scores from verification, propagation of administrator weights, consent and withdrawal in study sessions, and human-gated final review. One complete Bella scenario also checks the adopter's enquiry, replies by the rehomer and PawMatch operations, suitability and document review, joint meeting, trial and final sign-off, adoption approval, and chronological dates for every completed stage. These checks establish selected software behaviour; they do not establish usability, fairness, animal-welfare impact or adoption outcomes.</w:t>
+        <w:t>Table 4 reports checks run on the local working tree on 29 September 2026. All 50 automated tests passed. They cover role boundaries, listing ownership, consultation ownership, synthetic-case consistency, separation of scores from verification, propagation of administrator weights, consent and withdrawal in study sessions, prepared decline and completed-adoption outcomes, and human-gated final review. A complete Bella scenario begins with the rehomer's published listing and opaque listing number, then checks the adopter's enquiry, replies by the rehomer and PawMatch operations, suitability and document review, joint meeting, trial and final sign-off, adoption approval, and chronological dates for every completed stage. Seven additional HTTP suites passed against an isolated production build; these included 151 role/page/API boundary checks plus login, consultation, document, navigation, persistence, research-session and withdrawal journeys. These checks establish selected software behaviour; they do not establish usability, fairness, animal-welfare impact or adoption outcomes.</w:t>
       </w:r>
     </w:p>
     <w:p>
@@ -3259,7 +3446,7 @@
         <w:rPr>
           <w:color w:val="C00000"/>
         </w:rPr>
-        <w:t>Table 4 Local automated verification on 28 September 2026</w:t>
+        <w:t>Table 4 Local automated verification on 29 September 2026</w:t>
       </w:r>
     </w:p>
     <w:tbl>
@@ -3440,9 +3627,9 @@
             </w:pPr>
             <w:r>
               <w:rPr>
-                <w:color w:val="FF0000"/>
+                <w:color w:val="C00000"/>
               </w:rPr>
-              <w:t>42 passed; 0 failed</w:t>
+              <w:t>50 passed; 0 failed</w:t>
             </w:r>
           </w:p>
         </w:tc>
@@ -3469,9 +3656,9 @@
             </w:pPr>
             <w:r>
               <w:rPr>
-                <w:color w:val="FF0000"/>
+                <w:color w:val="C00000"/>
               </w:rPr>
-              <w:t>Roles, ownership, research sessions, scoring, review flow and an all-role completed adoption journey.</w:t>
+              <w:t>Listings, roles, ownership, research sessions, scoring, prepared outcomes and an all-role completed adoption journey.</w:t>
             </w:r>
           </w:p>
         </w:tc>
@@ -4399,9 +4586,9 @@
       </w:pPr>
       <w:r>
         <w:rPr>
-          <w:color w:val="FF0000"/>
+          <w:color w:val="C00000"/>
         </w:rPr>
-        <w:t>This study advances a specific design hypothesis: rehoming review may be simplified not by omitting checks, but by bringing each animal's care needs, the applicant's plan, outstanding evidence and the next human action into one traceable decision. The prototype implements that workflow, and 42 automated tests establish selected functional properties. A synthetic journey involving all four roles also completes one pet's enquiry through adoption approval while preserving permissions and chronological dates. These results do not show that people make better decisions with it.</w:t>
+        <w:t>This study advances a specific design hypothesis: rehoming review may be simplified not by omitting checks, but by bringing each animal's care needs, the applicant's plan, outstanding evidence and the next human action into one traceable decision. The prototype implements that workflow. All 50 automated tests and seven isolated production HTTP suites passed, including an all-role journey that begins with a published listing and completes enquiry, review and adoption approval while preserving permissions and chronological dates. These results establish technical feasibility and internal consistency, but do not show that people make better decisions with the interface.</w:t>
       </w:r>
     </w:p>
     <w:p>

</xml_diff>